<commit_message>
Add multi-typology bell curve analysis, 5% threshold filtering, and building classification module
</commit_message>
<xml_diff>
--- a/outputs/reports/Bhuj_Vulnerability_Assessment_Report.docx
+++ b/outputs/reports/Bhuj_Vulnerability_Assessment_Report.docx
@@ -246,7 +246,7 @@
                 <w:color w:val="222222"/>
                 <w:sz w:val="19"/>
               </w:rPr>
-              <w:t>October 14, 2026 | Official Engineering Assessment</w:t>
+              <w:t>October 17, 2026 | Official Engineering Assessment</w:t>
             </w:r>
           </w:p>
         </w:tc>
@@ -287,7 +287,7 @@
           <w:rFonts w:ascii="Arial" w:hAnsi="Arial"/>
           <w:sz w:val="20"/>
         </w:rPr>
-        <w:t>Total Unique Physical Buildings Validated: 83 (post-deduplication).</w:t>
+        <w:t>Total Unique Physical Buildings Validated: 81 (post-deduplication).</w:t>
       </w:r>
     </w:p>
     <w:p>
@@ -545,7 +545,7 @@
                 <w:color w:val="222222"/>
                 <w:sz w:val="19"/>
               </w:rPr>
-              <w:t>46</w:t>
+              <w:t>53</w:t>
             </w:r>
           </w:p>
         </w:tc>
@@ -570,7 +570,7 @@
                 <w:color w:val="222222"/>
                 <w:sz w:val="19"/>
               </w:rPr>
-              <w:t>55.4%</w:t>
+              <w:t>65.4%</w:t>
             </w:r>
           </w:p>
         </w:tc>
@@ -648,7 +648,7 @@
                 <w:color w:val="222222"/>
                 <w:sz w:val="19"/>
               </w:rPr>
-              <w:t>17</w:t>
+              <w:t>25</w:t>
             </w:r>
           </w:p>
         </w:tc>
@@ -673,7 +673,7 @@
                 <w:color w:val="222222"/>
                 <w:sz w:val="19"/>
               </w:rPr>
-              <w:t>20.5%</w:t>
+              <w:t>30.9%</w:t>
             </w:r>
           </w:p>
         </w:tc>
@@ -701,7 +701,7 @@
                 <w:color w:val="222222"/>
                 <w:sz w:val="19"/>
               </w:rPr>
-              <w:t>UNKNOWN</w:t>
+              <w:t>BCBM</w:t>
             </w:r>
           </w:p>
         </w:tc>
@@ -726,7 +726,7 @@
                 <w:color w:val="222222"/>
                 <w:sz w:val="19"/>
               </w:rPr>
-              <w:t>Unresolved structural classification / Insufficient visual cues</w:t>
+              <w:t>Burnt Clay Brick Masonry (Load-bearing walls &amp; industrial chimneys)</w:t>
             </w:r>
           </w:p>
         </w:tc>
@@ -751,7 +751,7 @@
                 <w:color w:val="222222"/>
                 <w:sz w:val="19"/>
               </w:rPr>
-              <w:t>16</w:t>
+              <w:t>3</w:t>
             </w:r>
           </w:p>
         </w:tc>
@@ -776,213 +776,7 @@
                 <w:color w:val="222222"/>
                 <w:sz w:val="19"/>
               </w:rPr>
-              <w:t>19.3%</w:t>
-            </w:r>
-          </w:p>
-        </w:tc>
-      </w:tr>
-      <w:tr>
-        <w:tc>
-          <w:tcPr>
-            <w:tcW w:type="dxa" w:w="1728"/>
-            <w:shd w:fill="FFFFFF"/>
-            <w:tcMar>
-              <w:top w:w="60" w:type="dxa"/>
-              <w:bottom w:w="60" w:type="dxa"/>
-              <w:left w:w="100" w:type="dxa"/>
-              <w:right w:w="100" w:type="dxa"/>
-            </w:tcMar>
-          </w:tcPr>
-          <w:p>
-            <w:pPr>
-              <w:jc w:val="left"/>
-            </w:pPr>
-            <w:r>
-              <w:rPr>
-                <w:rFonts w:ascii="Arial" w:hAnsi="Arial"/>
-                <w:b/>
-                <w:color w:val="222222"/>
-                <w:sz w:val="19"/>
-              </w:rPr>
-              <w:t>BCBM</w:t>
-            </w:r>
-          </w:p>
-        </w:tc>
-        <w:tc>
-          <w:tcPr>
-            <w:tcW w:type="dxa" w:w="4896"/>
-            <w:shd w:fill="FFFFFF"/>
-            <w:tcMar>
-              <w:top w:w="60" w:type="dxa"/>
-              <w:bottom w:w="60" w:type="dxa"/>
-              <w:left w:w="100" w:type="dxa"/>
-              <w:right w:w="100" w:type="dxa"/>
-            </w:tcMar>
-          </w:tcPr>
-          <w:p>
-            <w:pPr>
-              <w:jc w:val="left"/>
-            </w:pPr>
-            <w:r>
-              <w:rPr>
-                <w:rFonts w:ascii="Arial" w:hAnsi="Arial"/>
-                <w:color w:val="222222"/>
-                <w:sz w:val="19"/>
-              </w:rPr>
-              <w:t>Burnt Clay Brick Masonry (Load-bearing walls &amp; industrial chimneys)</w:t>
-            </w:r>
-          </w:p>
-        </w:tc>
-        <w:tc>
-          <w:tcPr>
-            <w:tcW w:type="dxa" w:w="1728"/>
-            <w:shd w:fill="FFFFFF"/>
-            <w:tcMar>
-              <w:top w:w="60" w:type="dxa"/>
-              <w:bottom w:w="60" w:type="dxa"/>
-              <w:left w:w="100" w:type="dxa"/>
-              <w:right w:w="100" w:type="dxa"/>
-            </w:tcMar>
-          </w:tcPr>
-          <w:p>
-            <w:pPr>
-              <w:jc w:val="right"/>
-            </w:pPr>
-            <w:r>
-              <w:rPr>
-                <w:rFonts w:ascii="Arial" w:hAnsi="Arial"/>
-                <w:color w:val="222222"/>
-                <w:sz w:val="19"/>
-              </w:rPr>
-              <w:t>3</w:t>
-            </w:r>
-          </w:p>
-        </w:tc>
-        <w:tc>
-          <w:tcPr>
-            <w:tcW w:type="dxa" w:w="1728"/>
-            <w:shd w:fill="FFFFFF"/>
-            <w:tcMar>
-              <w:top w:w="60" w:type="dxa"/>
-              <w:bottom w:w="60" w:type="dxa"/>
-              <w:left w:w="100" w:type="dxa"/>
-              <w:right w:w="100" w:type="dxa"/>
-            </w:tcMar>
-          </w:tcPr>
-          <w:p>
-            <w:pPr>
-              <w:jc w:val="right"/>
-            </w:pPr>
-            <w:r>
-              <w:rPr>
-                <w:rFonts w:ascii="Arial" w:hAnsi="Arial"/>
-                <w:color w:val="222222"/>
-                <w:sz w:val="19"/>
-              </w:rPr>
-              <w:t>3.6%</w:t>
-            </w:r>
-          </w:p>
-        </w:tc>
-      </w:tr>
-      <w:tr>
-        <w:tc>
-          <w:tcPr>
-            <w:tcW w:type="dxa" w:w="1728"/>
-            <w:shd w:fill="F8F9FA"/>
-            <w:tcMar>
-              <w:top w:w="60" w:type="dxa"/>
-              <w:bottom w:w="60" w:type="dxa"/>
-              <w:left w:w="100" w:type="dxa"/>
-              <w:right w:w="100" w:type="dxa"/>
-            </w:tcMar>
-          </w:tcPr>
-          <w:p>
-            <w:pPr>
-              <w:jc w:val="left"/>
-            </w:pPr>
-            <w:r>
-              <w:rPr>
-                <w:rFonts w:ascii="Arial" w:hAnsi="Arial"/>
-                <w:b/>
-                <w:color w:val="222222"/>
-                <w:sz w:val="19"/>
-              </w:rPr>
-              <w:t>DD</w:t>
-            </w:r>
-          </w:p>
-        </w:tc>
-        <w:tc>
-          <w:tcPr>
-            <w:tcW w:type="dxa" w:w="4896"/>
-            <w:shd w:fill="F8F9FA"/>
-            <w:tcMar>
-              <w:top w:w="60" w:type="dxa"/>
-              <w:bottom w:w="60" w:type="dxa"/>
-              <w:left w:w="100" w:type="dxa"/>
-              <w:right w:w="100" w:type="dxa"/>
-            </w:tcMar>
-          </w:tcPr>
-          <w:p>
-            <w:pPr>
-              <w:jc w:val="left"/>
-            </w:pPr>
-            <w:r>
-              <w:rPr>
-                <w:rFonts w:ascii="Arial" w:hAnsi="Arial"/>
-                <w:color w:val="222222"/>
-                <w:sz w:val="19"/>
-              </w:rPr>
-              <w:t>Dhajji Diwari (Timber / Wood Frame with Infill)</w:t>
-            </w:r>
-          </w:p>
-        </w:tc>
-        <w:tc>
-          <w:tcPr>
-            <w:tcW w:type="dxa" w:w="1728"/>
-            <w:shd w:fill="F8F9FA"/>
-            <w:tcMar>
-              <w:top w:w="60" w:type="dxa"/>
-              <w:bottom w:w="60" w:type="dxa"/>
-              <w:left w:w="100" w:type="dxa"/>
-              <w:right w:w="100" w:type="dxa"/>
-            </w:tcMar>
-          </w:tcPr>
-          <w:p>
-            <w:pPr>
-              <w:jc w:val="right"/>
-            </w:pPr>
-            <w:r>
-              <w:rPr>
-                <w:rFonts w:ascii="Arial" w:hAnsi="Arial"/>
-                <w:color w:val="222222"/>
-                <w:sz w:val="19"/>
-              </w:rPr>
-              <w:t>1</w:t>
-            </w:r>
-          </w:p>
-        </w:tc>
-        <w:tc>
-          <w:tcPr>
-            <w:tcW w:type="dxa" w:w="1728"/>
-            <w:shd w:fill="F8F9FA"/>
-            <w:tcMar>
-              <w:top w:w="60" w:type="dxa"/>
-              <w:bottom w:w="60" w:type="dxa"/>
-              <w:left w:w="100" w:type="dxa"/>
-              <w:right w:w="100" w:type="dxa"/>
-            </w:tcMar>
-          </w:tcPr>
-          <w:p>
-            <w:pPr>
-              <w:jc w:val="right"/>
-            </w:pPr>
-            <w:r>
-              <w:rPr>
-                <w:rFonts w:ascii="Arial" w:hAnsi="Arial"/>
-                <w:color w:val="222222"/>
-                <w:sz w:val="19"/>
-              </w:rPr>
-              <w:t>1.2%</w:t>
+              <w:t>3.7%</w:t>
             </w:r>
           </w:p>
         </w:tc>
@@ -1003,7 +797,7 @@
       <w:r>
         <w:drawing>
           <wp:inline xmlns:a="http://schemas.openxmlformats.org/drawingml/2006/main" xmlns:pic="http://schemas.openxmlformats.org/drawingml/2006/picture">
-            <wp:extent cx="5120640" cy="3072384"/>
+            <wp:extent cx="5120640" cy="3129280"/>
             <wp:docPr id="1" name="Picture 1"/>
             <wp:cNvGraphicFramePr>
               <a:graphicFrameLocks noChangeAspect="1"/>
@@ -1024,7 +818,7 @@
                   <pic:spPr>
                     <a:xfrm>
                       <a:off x="0" y="0"/>
-                      <a:ext cx="5120640" cy="3072384"/>
+                      <a:ext cx="5120640" cy="3129280"/>
                     </a:xfrm>
                     <a:prstGeom prst="rect"/>
                   </pic:spPr>
@@ -1075,7 +869,7 @@
           <w:rFonts w:ascii="Arial" w:hAnsi="Arial"/>
           <w:color w:val="2B5C8F"/>
         </w:rPr>
-        <w:t>Typology RC: Reinforced Concrete Frame (Open Storey / Infill / Shear Wall) (46 Buildings)</w:t>
+        <w:t>Typology RC: Reinforced Concrete Frame (Open Storey / Infill / Shear Wall) (53 Buildings)</w:t>
       </w:r>
     </w:p>
     <w:p>
@@ -1083,7 +877,7 @@
         <w:spacing w:after="120"/>
       </w:pPr>
       <w:r>
-        <w:t>Detailed breakdown of observed NDMA RVS parameters and additional post-earthquake failure mechanisms identified across the 46 buildings of typology RC:</w:t>
+        <w:t>Detailed breakdown of observed NDMA RVS parameters and additional post-earthquake failure mechanisms identified across the 53 buildings of typology RC:</w:t>
       </w:r>
     </w:p>
     <w:tbl>
@@ -1328,7 +1122,7 @@
                 <w:color w:val="222222"/>
                 <w:sz w:val="17"/>
               </w:rPr>
-              <w:t>23</w:t>
+              <w:t>24</w:t>
             </w:r>
           </w:p>
         </w:tc>
@@ -1353,7 +1147,7 @@
                 <w:color w:val="222222"/>
                 <w:sz w:val="17"/>
               </w:rPr>
-              <w:t>50.0%</w:t>
+              <w:t>45.3%</w:t>
             </w:r>
           </w:p>
         </w:tc>
@@ -1455,7 +1249,7 @@
                 <w:color w:val="222222"/>
                 <w:sz w:val="17"/>
               </w:rPr>
-              <w:t>23</w:t>
+              <w:t>24</w:t>
             </w:r>
           </w:p>
         </w:tc>
@@ -1480,7 +1274,7 @@
                 <w:color w:val="222222"/>
                 <w:sz w:val="17"/>
               </w:rPr>
-              <w:t>50.0%</w:t>
+              <w:t>45.3%</w:t>
             </w:r>
           </w:p>
         </w:tc>
@@ -1608,7 +1402,7 @@
                 <w:color w:val="222222"/>
                 <w:sz w:val="17"/>
               </w:rPr>
-              <w:t>19.6%</w:t>
+              <w:t>17.0%</w:t>
             </w:r>
           </w:p>
         </w:tc>
@@ -1736,7 +1530,7 @@
                 <w:color w:val="222222"/>
                 <w:sz w:val="17"/>
               </w:rPr>
-              <w:t>19.6%</w:t>
+              <w:t>17.0%</w:t>
             </w:r>
           </w:p>
         </w:tc>
@@ -1760,10 +1554,11 @@
             <w:r>
               <w:rPr>
                 <w:rFonts w:ascii="Arial" w:hAnsi="Arial"/>
-                <w:color w:val="222222"/>
+                <w:b/>
+                <w:color w:val="D95F02"/>
                 <w:sz w:val="17"/>
               </w:rPr>
-              <w:t>RVS Primer</w:t>
+              <w:t>Additional</w:t>
             </w:r>
           </w:p>
         </w:tc>
@@ -1788,7 +1583,7 @@
                 <w:color w:val="222222"/>
                 <w:sz w:val="17"/>
               </w:rPr>
-              <w:t>RC_RVS_9.2</w:t>
+              <w:t>ADD_RC_05</w:t>
             </w:r>
           </w:p>
         </w:tc>
@@ -1813,7 +1608,7 @@
                 <w:color w:val="222222"/>
                 <w:sz w:val="17"/>
               </w:rPr>
-              <w:t>Building has poor construction quality material.</w:t>
+              <w:t>Collapse of intermediate storey in commercial RC frame</w:t>
             </w:r>
           </w:p>
         </w:tc>
@@ -1838,7 +1633,7 @@
                 <w:color w:val="222222"/>
                 <w:sz w:val="17"/>
               </w:rPr>
-              <w:t>9</w:t>
+              <w:t>8</w:t>
             </w:r>
           </w:p>
         </w:tc>
@@ -1863,7 +1658,7 @@
                 <w:color w:val="222222"/>
                 <w:sz w:val="17"/>
               </w:rPr>
-              <w:t>19.6%</w:t>
+              <w:t>15.1%</w:t>
             </w:r>
           </w:p>
         </w:tc>
@@ -1916,7 +1711,7 @@
                 <w:color w:val="222222"/>
                 <w:sz w:val="17"/>
               </w:rPr>
-              <w:t>ADD_RC_05</w:t>
+              <w:t>ADD_RC_02</w:t>
             </w:r>
           </w:p>
         </w:tc>
@@ -1941,7 +1736,7 @@
                 <w:color w:val="222222"/>
                 <w:sz w:val="17"/>
               </w:rPr>
-              <w:t>Collapse of intermediate storey in commercial RC frame</w:t>
+              <w:t>Lack of core confinement / 90-degree ties with excessive longitudinal spacing</w:t>
             </w:r>
           </w:p>
         </w:tc>
@@ -1966,7 +1761,7 @@
                 <w:color w:val="222222"/>
                 <w:sz w:val="17"/>
               </w:rPr>
-              <w:t>8</w:t>
+              <w:t>5</w:t>
             </w:r>
           </w:p>
         </w:tc>
@@ -1991,7 +1786,1025 @@
                 <w:color w:val="222222"/>
                 <w:sz w:val="17"/>
               </w:rPr>
-              <w:t>17.4%</w:t>
+              <w:t>9.4%</w:t>
+            </w:r>
+          </w:p>
+        </w:tc>
+      </w:tr>
+      <w:tr>
+        <w:tc>
+          <w:tcPr>
+            <w:tcW w:type="dxa" w:w="1584"/>
+            <w:shd w:fill="F8F9FA"/>
+            <w:tcMar>
+              <w:top w:w="50" w:type="dxa"/>
+              <w:bottom w:w="50" w:type="dxa"/>
+              <w:left w:w="80" w:type="dxa"/>
+              <w:right w:w="80" w:type="dxa"/>
+            </w:tcMar>
+          </w:tcPr>
+          <w:p>
+            <w:pPr>
+              <w:jc w:val="left"/>
+            </w:pPr>
+            <w:r>
+              <w:rPr>
+                <w:rFonts w:ascii="Arial" w:hAnsi="Arial"/>
+                <w:color w:val="222222"/>
+                <w:sz w:val="17"/>
+              </w:rPr>
+              <w:t>RVS Primer</w:t>
+            </w:r>
+          </w:p>
+        </w:tc>
+        <w:tc>
+          <w:tcPr>
+            <w:tcW w:type="dxa" w:w="1728"/>
+            <w:shd w:fill="F8F9FA"/>
+            <w:tcMar>
+              <w:top w:w="50" w:type="dxa"/>
+              <w:bottom w:w="50" w:type="dxa"/>
+              <w:left w:w="80" w:type="dxa"/>
+              <w:right w:w="80" w:type="dxa"/>
+            </w:tcMar>
+          </w:tcPr>
+          <w:p>
+            <w:pPr>
+              <w:jc w:val="left"/>
+            </w:pPr>
+            <w:r>
+              <w:rPr>
+                <w:rFonts w:ascii="Arial" w:hAnsi="Arial"/>
+                <w:color w:val="222222"/>
+                <w:sz w:val="17"/>
+              </w:rPr>
+              <w:t>RC_POST_3.9</w:t>
+            </w:r>
+          </w:p>
+        </w:tc>
+        <w:tc>
+          <w:tcPr>
+            <w:tcW w:type="dxa" w:w="4752"/>
+            <w:shd w:fill="F8F9FA"/>
+            <w:tcMar>
+              <w:top w:w="50" w:type="dxa"/>
+              <w:bottom w:w="50" w:type="dxa"/>
+              <w:left w:w="80" w:type="dxa"/>
+              <w:right w:w="80" w:type="dxa"/>
+            </w:tcMar>
+          </w:tcPr>
+          <w:p>
+            <w:pPr>
+              <w:jc w:val="left"/>
+            </w:pPr>
+            <w:r>
+              <w:rPr>
+                <w:rFonts w:ascii="Arial" w:hAnsi="Arial"/>
+                <w:color w:val="222222"/>
+                <w:sz w:val="17"/>
+              </w:rPr>
+              <w:t>Building has extensive X cracking or out-of-plane collapse of infills.</w:t>
+            </w:r>
+          </w:p>
+        </w:tc>
+        <w:tc>
+          <w:tcPr>
+            <w:tcW w:type="dxa" w:w="1152"/>
+            <w:shd w:fill="F8F9FA"/>
+            <w:tcMar>
+              <w:top w:w="50" w:type="dxa"/>
+              <w:bottom w:w="50" w:type="dxa"/>
+              <w:left w:w="80" w:type="dxa"/>
+              <w:right w:w="80" w:type="dxa"/>
+            </w:tcMar>
+          </w:tcPr>
+          <w:p>
+            <w:pPr>
+              <w:jc w:val="right"/>
+            </w:pPr>
+            <w:r>
+              <w:rPr>
+                <w:rFonts w:ascii="Arial" w:hAnsi="Arial"/>
+                <w:color w:val="222222"/>
+                <w:sz w:val="17"/>
+              </w:rPr>
+              <w:t>5</w:t>
+            </w:r>
+          </w:p>
+        </w:tc>
+        <w:tc>
+          <w:tcPr>
+            <w:tcW w:type="dxa" w:w="1152"/>
+            <w:shd w:fill="F8F9FA"/>
+            <w:tcMar>
+              <w:top w:w="50" w:type="dxa"/>
+              <w:bottom w:w="50" w:type="dxa"/>
+              <w:left w:w="80" w:type="dxa"/>
+              <w:right w:w="80" w:type="dxa"/>
+            </w:tcMar>
+          </w:tcPr>
+          <w:p>
+            <w:pPr>
+              <w:jc w:val="right"/>
+            </w:pPr>
+            <w:r>
+              <w:rPr>
+                <w:rFonts w:ascii="Arial" w:hAnsi="Arial"/>
+                <w:color w:val="222222"/>
+                <w:sz w:val="17"/>
+              </w:rPr>
+              <w:t>9.4%</w:t>
+            </w:r>
+          </w:p>
+        </w:tc>
+      </w:tr>
+      <w:tr>
+        <w:tc>
+          <w:tcPr>
+            <w:tcW w:type="dxa" w:w="1584"/>
+            <w:shd w:fill="FFFFFF"/>
+            <w:tcMar>
+              <w:top w:w="50" w:type="dxa"/>
+              <w:bottom w:w="50" w:type="dxa"/>
+              <w:left w:w="80" w:type="dxa"/>
+              <w:right w:w="80" w:type="dxa"/>
+            </w:tcMar>
+          </w:tcPr>
+          <w:p>
+            <w:pPr>
+              <w:jc w:val="left"/>
+            </w:pPr>
+            <w:r>
+              <w:rPr>
+                <w:rFonts w:ascii="Arial" w:hAnsi="Arial"/>
+                <w:color w:val="222222"/>
+                <w:sz w:val="17"/>
+              </w:rPr>
+              <w:t>RVS Primer</w:t>
+            </w:r>
+          </w:p>
+        </w:tc>
+        <w:tc>
+          <w:tcPr>
+            <w:tcW w:type="dxa" w:w="1728"/>
+            <w:shd w:fill="FFFFFF"/>
+            <w:tcMar>
+              <w:top w:w="50" w:type="dxa"/>
+              <w:bottom w:w="50" w:type="dxa"/>
+              <w:left w:w="80" w:type="dxa"/>
+              <w:right w:w="80" w:type="dxa"/>
+            </w:tcMar>
+          </w:tcPr>
+          <w:p>
+            <w:pPr>
+              <w:jc w:val="left"/>
+            </w:pPr>
+            <w:r>
+              <w:rPr>
+                <w:rFonts w:ascii="Arial" w:hAnsi="Arial"/>
+                <w:color w:val="222222"/>
+                <w:sz w:val="17"/>
+              </w:rPr>
+              <w:t>RC_RVS_8.2</w:t>
+            </w:r>
+          </w:p>
+        </w:tc>
+        <w:tc>
+          <w:tcPr>
+            <w:tcW w:type="dxa" w:w="4752"/>
+            <w:shd w:fill="FFFFFF"/>
+            <w:tcMar>
+              <w:top w:w="50" w:type="dxa"/>
+              <w:bottom w:w="50" w:type="dxa"/>
+              <w:left w:w="80" w:type="dxa"/>
+              <w:right w:w="80" w:type="dxa"/>
+            </w:tcMar>
+          </w:tcPr>
+          <w:p>
+            <w:pPr>
+              <w:jc w:val="left"/>
+            </w:pPr>
+            <w:r>
+              <w:rPr>
+                <w:rFonts w:ascii="Arial" w:hAnsi="Arial"/>
+                <w:color w:val="222222"/>
+                <w:sz w:val="17"/>
+              </w:rPr>
+              <w:t>Building has RC walls unsymmetrical in both directions.</w:t>
+            </w:r>
+          </w:p>
+        </w:tc>
+        <w:tc>
+          <w:tcPr>
+            <w:tcW w:type="dxa" w:w="1152"/>
+            <w:shd w:fill="FFFFFF"/>
+            <w:tcMar>
+              <w:top w:w="50" w:type="dxa"/>
+              <w:bottom w:w="50" w:type="dxa"/>
+              <w:left w:w="80" w:type="dxa"/>
+              <w:right w:w="80" w:type="dxa"/>
+            </w:tcMar>
+          </w:tcPr>
+          <w:p>
+            <w:pPr>
+              <w:jc w:val="right"/>
+            </w:pPr>
+            <w:r>
+              <w:rPr>
+                <w:rFonts w:ascii="Arial" w:hAnsi="Arial"/>
+                <w:color w:val="222222"/>
+                <w:sz w:val="17"/>
+              </w:rPr>
+              <w:t>5</w:t>
+            </w:r>
+          </w:p>
+        </w:tc>
+        <w:tc>
+          <w:tcPr>
+            <w:tcW w:type="dxa" w:w="1152"/>
+            <w:shd w:fill="FFFFFF"/>
+            <w:tcMar>
+              <w:top w:w="50" w:type="dxa"/>
+              <w:bottom w:w="50" w:type="dxa"/>
+              <w:left w:w="80" w:type="dxa"/>
+              <w:right w:w="80" w:type="dxa"/>
+            </w:tcMar>
+          </w:tcPr>
+          <w:p>
+            <w:pPr>
+              <w:jc w:val="right"/>
+            </w:pPr>
+            <w:r>
+              <w:rPr>
+                <w:rFonts w:ascii="Arial" w:hAnsi="Arial"/>
+                <w:color w:val="222222"/>
+                <w:sz w:val="17"/>
+              </w:rPr>
+              <w:t>9.4%</w:t>
+            </w:r>
+          </w:p>
+        </w:tc>
+      </w:tr>
+      <w:tr>
+        <w:tc>
+          <w:tcPr>
+            <w:tcW w:type="dxa" w:w="1584"/>
+            <w:shd w:fill="F8F9FA"/>
+            <w:tcMar>
+              <w:top w:w="50" w:type="dxa"/>
+              <w:bottom w:w="50" w:type="dxa"/>
+              <w:left w:w="80" w:type="dxa"/>
+              <w:right w:w="80" w:type="dxa"/>
+            </w:tcMar>
+          </w:tcPr>
+          <w:p>
+            <w:pPr>
+              <w:jc w:val="left"/>
+            </w:pPr>
+            <w:r>
+              <w:rPr>
+                <w:rFonts w:ascii="Arial" w:hAnsi="Arial"/>
+                <w:color w:val="222222"/>
+                <w:sz w:val="17"/>
+              </w:rPr>
+              <w:t>RVS Primer</w:t>
+            </w:r>
+          </w:p>
+        </w:tc>
+        <w:tc>
+          <w:tcPr>
+            <w:tcW w:type="dxa" w:w="1728"/>
+            <w:shd w:fill="F8F9FA"/>
+            <w:tcMar>
+              <w:top w:w="50" w:type="dxa"/>
+              <w:bottom w:w="50" w:type="dxa"/>
+              <w:left w:w="80" w:type="dxa"/>
+              <w:right w:w="80" w:type="dxa"/>
+            </w:tcMar>
+          </w:tcPr>
+          <w:p>
+            <w:pPr>
+              <w:jc w:val="left"/>
+            </w:pPr>
+            <w:r>
+              <w:rPr>
+                <w:rFonts w:ascii="Arial" w:hAnsi="Arial"/>
+                <w:color w:val="222222"/>
+                <w:sz w:val="17"/>
+              </w:rPr>
+              <w:t>RC_RVS_3.6</w:t>
+            </w:r>
+          </w:p>
+        </w:tc>
+        <w:tc>
+          <w:tcPr>
+            <w:tcW w:type="dxa" w:w="4752"/>
+            <w:shd w:fill="F8F9FA"/>
+            <w:tcMar>
+              <w:top w:w="50" w:type="dxa"/>
+              <w:bottom w:w="50" w:type="dxa"/>
+              <w:left w:w="80" w:type="dxa"/>
+              <w:right w:w="80" w:type="dxa"/>
+            </w:tcMar>
+          </w:tcPr>
+          <w:p>
+            <w:pPr>
+              <w:jc w:val="left"/>
+            </w:pPr>
+            <w:r>
+              <w:rPr>
+                <w:rFonts w:ascii="Arial" w:hAnsi="Arial"/>
+                <w:color w:val="222222"/>
+                <w:sz w:val="17"/>
+              </w:rPr>
+              <w:t>Building has irregular plan geometry and or plan aspect ratio &gt; 4.0.</w:t>
+            </w:r>
+          </w:p>
+        </w:tc>
+        <w:tc>
+          <w:tcPr>
+            <w:tcW w:type="dxa" w:w="1152"/>
+            <w:shd w:fill="F8F9FA"/>
+            <w:tcMar>
+              <w:top w:w="50" w:type="dxa"/>
+              <w:bottom w:w="50" w:type="dxa"/>
+              <w:left w:w="80" w:type="dxa"/>
+              <w:right w:w="80" w:type="dxa"/>
+            </w:tcMar>
+          </w:tcPr>
+          <w:p>
+            <w:pPr>
+              <w:jc w:val="right"/>
+            </w:pPr>
+            <w:r>
+              <w:rPr>
+                <w:rFonts w:ascii="Arial" w:hAnsi="Arial"/>
+                <w:color w:val="222222"/>
+                <w:sz w:val="17"/>
+              </w:rPr>
+              <w:t>4</w:t>
+            </w:r>
+          </w:p>
+        </w:tc>
+        <w:tc>
+          <w:tcPr>
+            <w:tcW w:type="dxa" w:w="1152"/>
+            <w:shd w:fill="F8F9FA"/>
+            <w:tcMar>
+              <w:top w:w="50" w:type="dxa"/>
+              <w:bottom w:w="50" w:type="dxa"/>
+              <w:left w:w="80" w:type="dxa"/>
+              <w:right w:w="80" w:type="dxa"/>
+            </w:tcMar>
+          </w:tcPr>
+          <w:p>
+            <w:pPr>
+              <w:jc w:val="right"/>
+            </w:pPr>
+            <w:r>
+              <w:rPr>
+                <w:rFonts w:ascii="Arial" w:hAnsi="Arial"/>
+                <w:color w:val="222222"/>
+                <w:sz w:val="17"/>
+              </w:rPr>
+              <w:t>7.5%</w:t>
+            </w:r>
+          </w:p>
+        </w:tc>
+      </w:tr>
+      <w:tr>
+        <w:tc>
+          <w:tcPr>
+            <w:tcW w:type="dxa" w:w="1584"/>
+            <w:shd w:fill="FFFFFF"/>
+            <w:tcMar>
+              <w:top w:w="50" w:type="dxa"/>
+              <w:bottom w:w="50" w:type="dxa"/>
+              <w:left w:w="80" w:type="dxa"/>
+              <w:right w:w="80" w:type="dxa"/>
+            </w:tcMar>
+          </w:tcPr>
+          <w:p>
+            <w:pPr>
+              <w:jc w:val="left"/>
+            </w:pPr>
+            <w:r>
+              <w:rPr>
+                <w:rFonts w:ascii="Arial" w:hAnsi="Arial"/>
+                <w:b/>
+                <w:color w:val="D95F02"/>
+                <w:sz w:val="17"/>
+              </w:rPr>
+              <w:t>Additional</w:t>
+            </w:r>
+          </w:p>
+        </w:tc>
+        <w:tc>
+          <w:tcPr>
+            <w:tcW w:type="dxa" w:w="1728"/>
+            <w:shd w:fill="FFFFFF"/>
+            <w:tcMar>
+              <w:top w:w="50" w:type="dxa"/>
+              <w:bottom w:w="50" w:type="dxa"/>
+              <w:left w:w="80" w:type="dxa"/>
+              <w:right w:w="80" w:type="dxa"/>
+            </w:tcMar>
+          </w:tcPr>
+          <w:p>
+            <w:pPr>
+              <w:jc w:val="left"/>
+            </w:pPr>
+            <w:r>
+              <w:rPr>
+                <w:rFonts w:ascii="Arial" w:hAnsi="Arial"/>
+                <w:color w:val="222222"/>
+                <w:sz w:val="17"/>
+              </w:rPr>
+              <w:t>ADD_RC_04</w:t>
+            </w:r>
+          </w:p>
+        </w:tc>
+        <w:tc>
+          <w:tcPr>
+            <w:tcW w:type="dxa" w:w="4752"/>
+            <w:shd w:fill="FFFFFF"/>
+            <w:tcMar>
+              <w:top w:w="50" w:type="dxa"/>
+              <w:bottom w:w="50" w:type="dxa"/>
+              <w:left w:w="80" w:type="dxa"/>
+              <w:right w:w="80" w:type="dxa"/>
+            </w:tcMar>
+          </w:tcPr>
+          <w:p>
+            <w:pPr>
+              <w:jc w:val="left"/>
+            </w:pPr>
+            <w:r>
+              <w:rPr>
+                <w:rFonts w:ascii="Arial" w:hAnsi="Arial"/>
+                <w:color w:val="222222"/>
+                <w:sz w:val="17"/>
+              </w:rPr>
+              <w:t>Pancake collapse of multi-storey educational frame structure</w:t>
+            </w:r>
+          </w:p>
+        </w:tc>
+        <w:tc>
+          <w:tcPr>
+            <w:tcW w:type="dxa" w:w="1152"/>
+            <w:shd w:fill="FFFFFF"/>
+            <w:tcMar>
+              <w:top w:w="50" w:type="dxa"/>
+              <w:bottom w:w="50" w:type="dxa"/>
+              <w:left w:w="80" w:type="dxa"/>
+              <w:right w:w="80" w:type="dxa"/>
+            </w:tcMar>
+          </w:tcPr>
+          <w:p>
+            <w:pPr>
+              <w:jc w:val="right"/>
+            </w:pPr>
+            <w:r>
+              <w:rPr>
+                <w:rFonts w:ascii="Arial" w:hAnsi="Arial"/>
+                <w:color w:val="222222"/>
+                <w:sz w:val="17"/>
+              </w:rPr>
+              <w:t>4</w:t>
+            </w:r>
+          </w:p>
+        </w:tc>
+        <w:tc>
+          <w:tcPr>
+            <w:tcW w:type="dxa" w:w="1152"/>
+            <w:shd w:fill="FFFFFF"/>
+            <w:tcMar>
+              <w:top w:w="50" w:type="dxa"/>
+              <w:bottom w:w="50" w:type="dxa"/>
+              <w:left w:w="80" w:type="dxa"/>
+              <w:right w:w="80" w:type="dxa"/>
+            </w:tcMar>
+          </w:tcPr>
+          <w:p>
+            <w:pPr>
+              <w:jc w:val="right"/>
+            </w:pPr>
+            <w:r>
+              <w:rPr>
+                <w:rFonts w:ascii="Arial" w:hAnsi="Arial"/>
+                <w:color w:val="222222"/>
+                <w:sz w:val="17"/>
+              </w:rPr>
+              <w:t>7.5%</w:t>
+            </w:r>
+          </w:p>
+        </w:tc>
+      </w:tr>
+      <w:tr>
+        <w:tc>
+          <w:tcPr>
+            <w:tcW w:type="dxa" w:w="1584"/>
+            <w:shd w:fill="F8F9FA"/>
+            <w:tcMar>
+              <w:top w:w="50" w:type="dxa"/>
+              <w:bottom w:w="50" w:type="dxa"/>
+              <w:left w:w="80" w:type="dxa"/>
+              <w:right w:w="80" w:type="dxa"/>
+            </w:tcMar>
+          </w:tcPr>
+          <w:p>
+            <w:pPr>
+              <w:jc w:val="left"/>
+            </w:pPr>
+            <w:r>
+              <w:rPr>
+                <w:rFonts w:ascii="Arial" w:hAnsi="Arial"/>
+                <w:color w:val="222222"/>
+                <w:sz w:val="17"/>
+              </w:rPr>
+              <w:t>RVS Primer</w:t>
+            </w:r>
+          </w:p>
+        </w:tc>
+        <w:tc>
+          <w:tcPr>
+            <w:tcW w:type="dxa" w:w="1728"/>
+            <w:shd w:fill="F8F9FA"/>
+            <w:tcMar>
+              <w:top w:w="50" w:type="dxa"/>
+              <w:bottom w:w="50" w:type="dxa"/>
+              <w:left w:w="80" w:type="dxa"/>
+              <w:right w:w="80" w:type="dxa"/>
+            </w:tcMar>
+          </w:tcPr>
+          <w:p>
+            <w:pPr>
+              <w:jc w:val="left"/>
+            </w:pPr>
+            <w:r>
+              <w:rPr>
+                <w:rFonts w:ascii="Arial" w:hAnsi="Arial"/>
+                <w:color w:val="222222"/>
+                <w:sz w:val="17"/>
+              </w:rPr>
+              <w:t>RC_RVS_8.4</w:t>
+            </w:r>
+          </w:p>
+        </w:tc>
+        <w:tc>
+          <w:tcPr>
+            <w:tcW w:type="dxa" w:w="4752"/>
+            <w:shd w:fill="F8F9FA"/>
+            <w:tcMar>
+              <w:top w:w="50" w:type="dxa"/>
+              <w:bottom w:w="50" w:type="dxa"/>
+              <w:left w:w="80" w:type="dxa"/>
+              <w:right w:w="80" w:type="dxa"/>
+            </w:tcMar>
+          </w:tcPr>
+          <w:p>
+            <w:pPr>
+              <w:jc w:val="left"/>
+            </w:pPr>
+            <w:r>
+              <w:rPr>
+                <w:rFonts w:ascii="Arial" w:hAnsi="Arial"/>
+                <w:color w:val="222222"/>
+                <w:sz w:val="17"/>
+              </w:rPr>
+              <w:t>Building has unanchored water tanks on roof.</w:t>
+            </w:r>
+          </w:p>
+        </w:tc>
+        <w:tc>
+          <w:tcPr>
+            <w:tcW w:type="dxa" w:w="1152"/>
+            <w:shd w:fill="F8F9FA"/>
+            <w:tcMar>
+              <w:top w:w="50" w:type="dxa"/>
+              <w:bottom w:w="50" w:type="dxa"/>
+              <w:left w:w="80" w:type="dxa"/>
+              <w:right w:w="80" w:type="dxa"/>
+            </w:tcMar>
+          </w:tcPr>
+          <w:p>
+            <w:pPr>
+              <w:jc w:val="right"/>
+            </w:pPr>
+            <w:r>
+              <w:rPr>
+                <w:rFonts w:ascii="Arial" w:hAnsi="Arial"/>
+                <w:color w:val="222222"/>
+                <w:sz w:val="17"/>
+              </w:rPr>
+              <w:t>4</w:t>
+            </w:r>
+          </w:p>
+        </w:tc>
+        <w:tc>
+          <w:tcPr>
+            <w:tcW w:type="dxa" w:w="1152"/>
+            <w:shd w:fill="F8F9FA"/>
+            <w:tcMar>
+              <w:top w:w="50" w:type="dxa"/>
+              <w:bottom w:w="50" w:type="dxa"/>
+              <w:left w:w="80" w:type="dxa"/>
+              <w:right w:w="80" w:type="dxa"/>
+            </w:tcMar>
+          </w:tcPr>
+          <w:p>
+            <w:pPr>
+              <w:jc w:val="right"/>
+            </w:pPr>
+            <w:r>
+              <w:rPr>
+                <w:rFonts w:ascii="Arial" w:hAnsi="Arial"/>
+                <w:color w:val="222222"/>
+                <w:sz w:val="17"/>
+              </w:rPr>
+              <w:t>7.5%</w:t>
+            </w:r>
+          </w:p>
+        </w:tc>
+      </w:tr>
+      <w:tr>
+        <w:tc>
+          <w:tcPr>
+            <w:tcW w:type="dxa" w:w="1584"/>
+            <w:shd w:fill="FFFFFF"/>
+            <w:tcMar>
+              <w:top w:w="50" w:type="dxa"/>
+              <w:bottom w:w="50" w:type="dxa"/>
+              <w:left w:w="80" w:type="dxa"/>
+              <w:right w:w="80" w:type="dxa"/>
+            </w:tcMar>
+          </w:tcPr>
+          <w:p>
+            <w:pPr>
+              <w:jc w:val="left"/>
+            </w:pPr>
+            <w:r>
+              <w:rPr>
+                <w:rFonts w:ascii="Arial" w:hAnsi="Arial"/>
+                <w:color w:val="222222"/>
+                <w:sz w:val="17"/>
+              </w:rPr>
+              <w:t>RVS Primer</w:t>
+            </w:r>
+          </w:p>
+        </w:tc>
+        <w:tc>
+          <w:tcPr>
+            <w:tcW w:type="dxa" w:w="1728"/>
+            <w:shd w:fill="FFFFFF"/>
+            <w:tcMar>
+              <w:top w:w="50" w:type="dxa"/>
+              <w:bottom w:w="50" w:type="dxa"/>
+              <w:left w:w="80" w:type="dxa"/>
+              <w:right w:w="80" w:type="dxa"/>
+            </w:tcMar>
+          </w:tcPr>
+          <w:p>
+            <w:pPr>
+              <w:jc w:val="left"/>
+            </w:pPr>
+            <w:r>
+              <w:rPr>
+                <w:rFonts w:ascii="Arial" w:hAnsi="Arial"/>
+                <w:color w:val="222222"/>
+                <w:sz w:val="17"/>
+              </w:rPr>
+              <w:t>RC_POST_5.2</w:t>
+            </w:r>
+          </w:p>
+        </w:tc>
+        <w:tc>
+          <w:tcPr>
+            <w:tcW w:type="dxa" w:w="4752"/>
+            <w:shd w:fill="FFFFFF"/>
+            <w:tcMar>
+              <w:top w:w="50" w:type="dxa"/>
+              <w:bottom w:w="50" w:type="dxa"/>
+              <w:left w:w="80" w:type="dxa"/>
+              <w:right w:w="80" w:type="dxa"/>
+            </w:tcMar>
+          </w:tcPr>
+          <w:p>
+            <w:pPr>
+              <w:jc w:val="left"/>
+            </w:pPr>
+            <w:r>
+              <w:rPr>
+                <w:rFonts w:ascii="Arial" w:hAnsi="Arial"/>
+                <w:color w:val="222222"/>
+                <w:sz w:val="17"/>
+              </w:rPr>
+              <w:t>Building has water tanks on roof displaced from their supports.</w:t>
+            </w:r>
+          </w:p>
+        </w:tc>
+        <w:tc>
+          <w:tcPr>
+            <w:tcW w:type="dxa" w:w="1152"/>
+            <w:shd w:fill="FFFFFF"/>
+            <w:tcMar>
+              <w:top w:w="50" w:type="dxa"/>
+              <w:bottom w:w="50" w:type="dxa"/>
+              <w:left w:w="80" w:type="dxa"/>
+              <w:right w:w="80" w:type="dxa"/>
+            </w:tcMar>
+          </w:tcPr>
+          <w:p>
+            <w:pPr>
+              <w:jc w:val="right"/>
+            </w:pPr>
+            <w:r>
+              <w:rPr>
+                <w:rFonts w:ascii="Arial" w:hAnsi="Arial"/>
+                <w:color w:val="222222"/>
+                <w:sz w:val="17"/>
+              </w:rPr>
+              <w:t>4</w:t>
+            </w:r>
+          </w:p>
+        </w:tc>
+        <w:tc>
+          <w:tcPr>
+            <w:tcW w:type="dxa" w:w="1152"/>
+            <w:shd w:fill="FFFFFF"/>
+            <w:tcMar>
+              <w:top w:w="50" w:type="dxa"/>
+              <w:bottom w:w="50" w:type="dxa"/>
+              <w:left w:w="80" w:type="dxa"/>
+              <w:right w:w="80" w:type="dxa"/>
+            </w:tcMar>
+          </w:tcPr>
+          <w:p>
+            <w:pPr>
+              <w:jc w:val="right"/>
+            </w:pPr>
+            <w:r>
+              <w:rPr>
+                <w:rFonts w:ascii="Arial" w:hAnsi="Arial"/>
+                <w:color w:val="222222"/>
+                <w:sz w:val="17"/>
+              </w:rPr>
+              <w:t>7.5%</w:t>
+            </w:r>
+          </w:p>
+        </w:tc>
+      </w:tr>
+      <w:tr>
+        <w:tc>
+          <w:tcPr>
+            <w:tcW w:type="dxa" w:w="1584"/>
+            <w:shd w:fill="F8F9FA"/>
+            <w:tcMar>
+              <w:top w:w="50" w:type="dxa"/>
+              <w:bottom w:w="50" w:type="dxa"/>
+              <w:left w:w="80" w:type="dxa"/>
+              <w:right w:w="80" w:type="dxa"/>
+            </w:tcMar>
+          </w:tcPr>
+          <w:p>
+            <w:pPr>
+              <w:jc w:val="left"/>
+            </w:pPr>
+            <w:r>
+              <w:rPr>
+                <w:rFonts w:ascii="Arial" w:hAnsi="Arial"/>
+                <w:color w:val="222222"/>
+                <w:sz w:val="17"/>
+              </w:rPr>
+              <w:t>RVS Primer</w:t>
+            </w:r>
+          </w:p>
+        </w:tc>
+        <w:tc>
+          <w:tcPr>
+            <w:tcW w:type="dxa" w:w="1728"/>
+            <w:shd w:fill="F8F9FA"/>
+            <w:tcMar>
+              <w:top w:w="50" w:type="dxa"/>
+              <w:bottom w:w="50" w:type="dxa"/>
+              <w:left w:w="80" w:type="dxa"/>
+              <w:right w:w="80" w:type="dxa"/>
+            </w:tcMar>
+          </w:tcPr>
+          <w:p>
+            <w:pPr>
+              <w:jc w:val="left"/>
+            </w:pPr>
+            <w:r>
+              <w:rPr>
+                <w:rFonts w:ascii="Arial" w:hAnsi="Arial"/>
+                <w:color w:val="222222"/>
+                <w:sz w:val="17"/>
+              </w:rPr>
+              <w:t>RC_RVS_9.1</w:t>
+            </w:r>
+          </w:p>
+        </w:tc>
+        <w:tc>
+          <w:tcPr>
+            <w:tcW w:type="dxa" w:w="4752"/>
+            <w:shd w:fill="F8F9FA"/>
+            <w:tcMar>
+              <w:top w:w="50" w:type="dxa"/>
+              <w:bottom w:w="50" w:type="dxa"/>
+              <w:left w:w="80" w:type="dxa"/>
+              <w:right w:w="80" w:type="dxa"/>
+            </w:tcMar>
+          </w:tcPr>
+          <w:p>
+            <w:pPr>
+              <w:jc w:val="left"/>
+            </w:pPr>
+            <w:r>
+              <w:rPr>
+                <w:rFonts w:ascii="Arial" w:hAnsi="Arial"/>
+                <w:color w:val="222222"/>
+                <w:sz w:val="17"/>
+              </w:rPr>
+              <w:t>Building has longitudinal cracks and/or spalling in Beams and Columns.</w:t>
+            </w:r>
+          </w:p>
+        </w:tc>
+        <w:tc>
+          <w:tcPr>
+            <w:tcW w:type="dxa" w:w="1152"/>
+            <w:shd w:fill="F8F9FA"/>
+            <w:tcMar>
+              <w:top w:w="50" w:type="dxa"/>
+              <w:bottom w:w="50" w:type="dxa"/>
+              <w:left w:w="80" w:type="dxa"/>
+              <w:right w:w="80" w:type="dxa"/>
+            </w:tcMar>
+          </w:tcPr>
+          <w:p>
+            <w:pPr>
+              <w:jc w:val="right"/>
+            </w:pPr>
+            <w:r>
+              <w:rPr>
+                <w:rFonts w:ascii="Arial" w:hAnsi="Arial"/>
+                <w:color w:val="222222"/>
+                <w:sz w:val="17"/>
+              </w:rPr>
+              <w:t>4</w:t>
+            </w:r>
+          </w:p>
+        </w:tc>
+        <w:tc>
+          <w:tcPr>
+            <w:tcW w:type="dxa" w:w="1152"/>
+            <w:shd w:fill="F8F9FA"/>
+            <w:tcMar>
+              <w:top w:w="50" w:type="dxa"/>
+              <w:bottom w:w="50" w:type="dxa"/>
+              <w:left w:w="80" w:type="dxa"/>
+              <w:right w:w="80" w:type="dxa"/>
+            </w:tcMar>
+          </w:tcPr>
+          <w:p>
+            <w:pPr>
+              <w:jc w:val="right"/>
+            </w:pPr>
+            <w:r>
+              <w:rPr>
+                <w:rFonts w:ascii="Arial" w:hAnsi="Arial"/>
+                <w:color w:val="222222"/>
+                <w:sz w:val="17"/>
+              </w:rPr>
+              <w:t>7.5%</w:t>
+            </w:r>
+          </w:p>
+        </w:tc>
+      </w:tr>
+      <w:tr>
+        <w:tc>
+          <w:tcPr>
+            <w:tcW w:type="dxa" w:w="1584"/>
+            <w:shd w:fill="FFFFFF"/>
+            <w:tcMar>
+              <w:top w:w="50" w:type="dxa"/>
+              <w:bottom w:w="50" w:type="dxa"/>
+              <w:left w:w="80" w:type="dxa"/>
+              <w:right w:w="80" w:type="dxa"/>
+            </w:tcMar>
+          </w:tcPr>
+          <w:p>
+            <w:pPr>
+              <w:jc w:val="left"/>
+            </w:pPr>
+            <w:r>
+              <w:rPr>
+                <w:rFonts w:ascii="Arial" w:hAnsi="Arial"/>
+                <w:b/>
+                <w:color w:val="D95F02"/>
+                <w:sz w:val="17"/>
+              </w:rPr>
+              <w:t>Additional</w:t>
+            </w:r>
+          </w:p>
+        </w:tc>
+        <w:tc>
+          <w:tcPr>
+            <w:tcW w:type="dxa" w:w="1728"/>
+            <w:shd w:fill="FFFFFF"/>
+            <w:tcMar>
+              <w:top w:w="50" w:type="dxa"/>
+              <w:bottom w:w="50" w:type="dxa"/>
+              <w:left w:w="80" w:type="dxa"/>
+              <w:right w:w="80" w:type="dxa"/>
+            </w:tcMar>
+          </w:tcPr>
+          <w:p>
+            <w:pPr>
+              <w:jc w:val="left"/>
+            </w:pPr>
+            <w:r>
+              <w:rPr>
+                <w:rFonts w:ascii="Arial" w:hAnsi="Arial"/>
+                <w:color w:val="222222"/>
+                <w:sz w:val="17"/>
+              </w:rPr>
+              <w:t>ADD_RC_08</w:t>
+            </w:r>
+          </w:p>
+        </w:tc>
+        <w:tc>
+          <w:tcPr>
+            <w:tcW w:type="dxa" w:w="4752"/>
+            <w:shd w:fill="FFFFFF"/>
+            <w:tcMar>
+              <w:top w:w="50" w:type="dxa"/>
+              <w:bottom w:w="50" w:type="dxa"/>
+              <w:left w:w="80" w:type="dxa"/>
+              <w:right w:w="80" w:type="dxa"/>
+            </w:tcMar>
+          </w:tcPr>
+          <w:p>
+            <w:pPr>
+              <w:jc w:val="left"/>
+            </w:pPr>
+            <w:r>
+              <w:rPr>
+                <w:rFonts w:ascii="Arial" w:hAnsi="Arial"/>
+                <w:color w:val="222222"/>
+                <w:sz w:val="17"/>
+              </w:rPr>
+              <w:t>Improper post-earthquake column jacketing not extended to foundations or beam joints</w:t>
+            </w:r>
+          </w:p>
+        </w:tc>
+        <w:tc>
+          <w:tcPr>
+            <w:tcW w:type="dxa" w:w="1152"/>
+            <w:shd w:fill="FFFFFF"/>
+            <w:tcMar>
+              <w:top w:w="50" w:type="dxa"/>
+              <w:bottom w:w="50" w:type="dxa"/>
+              <w:left w:w="80" w:type="dxa"/>
+              <w:right w:w="80" w:type="dxa"/>
+            </w:tcMar>
+          </w:tcPr>
+          <w:p>
+            <w:pPr>
+              <w:jc w:val="right"/>
+            </w:pPr>
+            <w:r>
+              <w:rPr>
+                <w:rFonts w:ascii="Arial" w:hAnsi="Arial"/>
+                <w:color w:val="222222"/>
+                <w:sz w:val="17"/>
+              </w:rPr>
+              <w:t>4</w:t>
+            </w:r>
+          </w:p>
+        </w:tc>
+        <w:tc>
+          <w:tcPr>
+            <w:tcW w:type="dxa" w:w="1152"/>
+            <w:shd w:fill="FFFFFF"/>
+            <w:tcMar>
+              <w:top w:w="50" w:type="dxa"/>
+              <w:bottom w:w="50" w:type="dxa"/>
+              <w:left w:w="80" w:type="dxa"/>
+              <w:right w:w="80" w:type="dxa"/>
+            </w:tcMar>
+          </w:tcPr>
+          <w:p>
+            <w:pPr>
+              <w:jc w:val="right"/>
+            </w:pPr>
+            <w:r>
+              <w:rPr>
+                <w:rFonts w:ascii="Arial" w:hAnsi="Arial"/>
+                <w:color w:val="222222"/>
+                <w:sz w:val="17"/>
+              </w:rPr>
+              <w:t>7.5%</w:t>
             </w:r>
           </w:p>
         </w:tc>
@@ -2044,7 +2857,7 @@
                 <w:color w:val="222222"/>
                 <w:sz w:val="17"/>
               </w:rPr>
-              <w:t>ADD_RC_02</w:t>
+              <w:t>ADD_RC_06</w:t>
             </w:r>
           </w:p>
         </w:tc>
@@ -2069,7 +2882,7 @@
                 <w:color w:val="222222"/>
                 <w:sz w:val="17"/>
               </w:rPr>
-              <w:t>Lack of core confinement / 90-degree ties with excessive longitudinal spacing</w:t>
+              <w:t>Dislodging of weakly connected overhead water tank appendages</w:t>
             </w:r>
           </w:p>
         </w:tc>
@@ -2094,7 +2907,7 @@
                 <w:color w:val="222222"/>
                 <w:sz w:val="17"/>
               </w:rPr>
-              <w:t>5</w:t>
+              <w:t>3</w:t>
             </w:r>
           </w:p>
         </w:tc>
@@ -2119,7 +2932,7 @@
                 <w:color w:val="222222"/>
                 <w:sz w:val="17"/>
               </w:rPr>
-              <w:t>10.9%</w:t>
+              <w:t>5.7%</w:t>
             </w:r>
           </w:p>
         </w:tc>
@@ -2171,7 +2984,7 @@
                 <w:color w:val="222222"/>
                 <w:sz w:val="17"/>
               </w:rPr>
-              <w:t>RC_POST_3.9</w:t>
+              <w:t>RC_RVS_3.5</w:t>
             </w:r>
           </w:p>
         </w:tc>
@@ -2196,7 +3009,7 @@
                 <w:color w:val="222222"/>
                 <w:sz w:val="17"/>
               </w:rPr>
-              <w:t>Building has extensive X cracking or out-of-plane collapse of infills.</w:t>
+              <w:t>Building has RC frame with Floating Columns.</w:t>
             </w:r>
           </w:p>
         </w:tc>
@@ -2221,7 +3034,7 @@
                 <w:color w:val="222222"/>
                 <w:sz w:val="17"/>
               </w:rPr>
-              <w:t>5</w:t>
+              <w:t>2</w:t>
             </w:r>
           </w:p>
         </w:tc>
@@ -2246,7 +3059,7 @@
                 <w:color w:val="222222"/>
                 <w:sz w:val="17"/>
               </w:rPr>
-              <w:t>10.9%</w:t>
+              <w:t>3.8%</w:t>
             </w:r>
           </w:p>
         </w:tc>
@@ -2298,7 +3111,7 @@
                 <w:color w:val="222222"/>
                 <w:sz w:val="17"/>
               </w:rPr>
-              <w:t>RC_RVS_8.2</w:t>
+              <w:t>RC_RVS_7.3</w:t>
             </w:r>
           </w:p>
         </w:tc>
@@ -2323,7 +3136,7 @@
                 <w:color w:val="222222"/>
                 <w:sz w:val="17"/>
               </w:rPr>
-              <w:t>Building has RC walls unsymmetrical in both directions.</w:t>
+              <w:t>Building has large or heavy cantilever balconies or sunshades.</w:t>
             </w:r>
           </w:p>
         </w:tc>
@@ -2348,7 +3161,7 @@
                 <w:color w:val="222222"/>
                 <w:sz w:val="17"/>
               </w:rPr>
-              <w:t>5</w:t>
+              <w:t>2</w:t>
             </w:r>
           </w:p>
         </w:tc>
@@ -2373,7 +3186,7 @@
                 <w:color w:val="222222"/>
                 <w:sz w:val="17"/>
               </w:rPr>
-              <w:t>10.9%</w:t>
+              <w:t>3.8%</w:t>
             </w:r>
           </w:p>
         </w:tc>
@@ -2425,7 +3238,7 @@
                 <w:color w:val="222222"/>
                 <w:sz w:val="17"/>
               </w:rPr>
-              <w:t>RC_RVS_3.6</w:t>
+              <w:t>RC_POST_3.4</w:t>
             </w:r>
           </w:p>
         </w:tc>
@@ -2450,7 +3263,7 @@
                 <w:color w:val="222222"/>
                 <w:sz w:val="17"/>
               </w:rPr>
-              <w:t>Building has irregular plan geometry and or plan aspect ratio &gt; 4.0.</w:t>
+              <w:t>Building has Floating Columns with cracked supporting beams.</w:t>
             </w:r>
           </w:p>
         </w:tc>
@@ -2475,7 +3288,7 @@
                 <w:color w:val="222222"/>
                 <w:sz w:val="17"/>
               </w:rPr>
-              <w:t>4</w:t>
+              <w:t>2</w:t>
             </w:r>
           </w:p>
         </w:tc>
@@ -2500,7 +3313,261 @@
                 <w:color w:val="222222"/>
                 <w:sz w:val="17"/>
               </w:rPr>
-              <w:t>8.7%</w:t>
+              <w:t>3.8%</w:t>
+            </w:r>
+          </w:p>
+        </w:tc>
+      </w:tr>
+      <w:tr>
+        <w:tc>
+          <w:tcPr>
+            <w:tcW w:type="dxa" w:w="1584"/>
+            <w:shd w:fill="F8F9FA"/>
+            <w:tcMar>
+              <w:top w:w="50" w:type="dxa"/>
+              <w:bottom w:w="50" w:type="dxa"/>
+              <w:left w:w="80" w:type="dxa"/>
+              <w:right w:w="80" w:type="dxa"/>
+            </w:tcMar>
+          </w:tcPr>
+          <w:p>
+            <w:pPr>
+              <w:jc w:val="left"/>
+            </w:pPr>
+            <w:r>
+              <w:rPr>
+                <w:rFonts w:ascii="Arial" w:hAnsi="Arial"/>
+                <w:color w:val="222222"/>
+                <w:sz w:val="17"/>
+              </w:rPr>
+              <w:t>RVS Primer</w:t>
+            </w:r>
+          </w:p>
+        </w:tc>
+        <w:tc>
+          <w:tcPr>
+            <w:tcW w:type="dxa" w:w="1728"/>
+            <w:shd w:fill="F8F9FA"/>
+            <w:tcMar>
+              <w:top w:w="50" w:type="dxa"/>
+              <w:bottom w:w="50" w:type="dxa"/>
+              <w:left w:w="80" w:type="dxa"/>
+              <w:right w:w="80" w:type="dxa"/>
+            </w:tcMar>
+          </w:tcPr>
+          <w:p>
+            <w:pPr>
+              <w:jc w:val="left"/>
+            </w:pPr>
+            <w:r>
+              <w:rPr>
+                <w:rFonts w:ascii="Arial" w:hAnsi="Arial"/>
+                <w:color w:val="222222"/>
+                <w:sz w:val="17"/>
+              </w:rPr>
+              <w:t>RC_POST_3.5</w:t>
+            </w:r>
+          </w:p>
+        </w:tc>
+        <w:tc>
+          <w:tcPr>
+            <w:tcW w:type="dxa" w:w="4752"/>
+            <w:shd w:fill="F8F9FA"/>
+            <w:tcMar>
+              <w:top w:w="50" w:type="dxa"/>
+              <w:bottom w:w="50" w:type="dxa"/>
+              <w:left w:w="80" w:type="dxa"/>
+              <w:right w:w="80" w:type="dxa"/>
+            </w:tcMar>
+          </w:tcPr>
+          <w:p>
+            <w:pPr>
+              <w:jc w:val="left"/>
+            </w:pPr>
+            <w:r>
+              <w:rPr>
+                <w:rFonts w:ascii="Arial" w:hAnsi="Arial"/>
+                <w:color w:val="222222"/>
+                <w:sz w:val="17"/>
+              </w:rPr>
+              <w:t>Building has main load resisting columns with shear cracks.</w:t>
+            </w:r>
+          </w:p>
+        </w:tc>
+        <w:tc>
+          <w:tcPr>
+            <w:tcW w:type="dxa" w:w="1152"/>
+            <w:shd w:fill="F8F9FA"/>
+            <w:tcMar>
+              <w:top w:w="50" w:type="dxa"/>
+              <w:bottom w:w="50" w:type="dxa"/>
+              <w:left w:w="80" w:type="dxa"/>
+              <w:right w:w="80" w:type="dxa"/>
+            </w:tcMar>
+          </w:tcPr>
+          <w:p>
+            <w:pPr>
+              <w:jc w:val="right"/>
+            </w:pPr>
+            <w:r>
+              <w:rPr>
+                <w:rFonts w:ascii="Arial" w:hAnsi="Arial"/>
+                <w:color w:val="222222"/>
+                <w:sz w:val="17"/>
+              </w:rPr>
+              <w:t>2</w:t>
+            </w:r>
+          </w:p>
+        </w:tc>
+        <w:tc>
+          <w:tcPr>
+            <w:tcW w:type="dxa" w:w="1152"/>
+            <w:shd w:fill="F8F9FA"/>
+            <w:tcMar>
+              <w:top w:w="50" w:type="dxa"/>
+              <w:bottom w:w="50" w:type="dxa"/>
+              <w:left w:w="80" w:type="dxa"/>
+              <w:right w:w="80" w:type="dxa"/>
+            </w:tcMar>
+          </w:tcPr>
+          <w:p>
+            <w:pPr>
+              <w:jc w:val="right"/>
+            </w:pPr>
+            <w:r>
+              <w:rPr>
+                <w:rFonts w:ascii="Arial" w:hAnsi="Arial"/>
+                <w:color w:val="222222"/>
+                <w:sz w:val="17"/>
+              </w:rPr>
+              <w:t>3.8%</w:t>
+            </w:r>
+          </w:p>
+        </w:tc>
+      </w:tr>
+      <w:tr>
+        <w:tc>
+          <w:tcPr>
+            <w:tcW w:type="dxa" w:w="1584"/>
+            <w:shd w:fill="FFFFFF"/>
+            <w:tcMar>
+              <w:top w:w="50" w:type="dxa"/>
+              <w:bottom w:w="50" w:type="dxa"/>
+              <w:left w:w="80" w:type="dxa"/>
+              <w:right w:w="80" w:type="dxa"/>
+            </w:tcMar>
+          </w:tcPr>
+          <w:p>
+            <w:pPr>
+              <w:jc w:val="left"/>
+            </w:pPr>
+            <w:r>
+              <w:rPr>
+                <w:rFonts w:ascii="Arial" w:hAnsi="Arial"/>
+                <w:color w:val="222222"/>
+                <w:sz w:val="17"/>
+              </w:rPr>
+              <w:t>RVS Primer</w:t>
+            </w:r>
+          </w:p>
+        </w:tc>
+        <w:tc>
+          <w:tcPr>
+            <w:tcW w:type="dxa" w:w="1728"/>
+            <w:shd w:fill="FFFFFF"/>
+            <w:tcMar>
+              <w:top w:w="50" w:type="dxa"/>
+              <w:bottom w:w="50" w:type="dxa"/>
+              <w:left w:w="80" w:type="dxa"/>
+              <w:right w:w="80" w:type="dxa"/>
+            </w:tcMar>
+          </w:tcPr>
+          <w:p>
+            <w:pPr>
+              <w:jc w:val="left"/>
+            </w:pPr>
+            <w:r>
+              <w:rPr>
+                <w:rFonts w:ascii="Arial" w:hAnsi="Arial"/>
+                <w:color w:val="222222"/>
+                <w:sz w:val="17"/>
+              </w:rPr>
+              <w:t>RC_POST_5.1</w:t>
+            </w:r>
+          </w:p>
+        </w:tc>
+        <w:tc>
+          <w:tcPr>
+            <w:tcW w:type="dxa" w:w="4752"/>
+            <w:shd w:fill="FFFFFF"/>
+            <w:tcMar>
+              <w:top w:w="50" w:type="dxa"/>
+              <w:bottom w:w="50" w:type="dxa"/>
+              <w:left w:w="80" w:type="dxa"/>
+              <w:right w:w="80" w:type="dxa"/>
+            </w:tcMar>
+          </w:tcPr>
+          <w:p>
+            <w:pPr>
+              <w:jc w:val="left"/>
+            </w:pPr>
+            <w:r>
+              <w:rPr>
+                <w:rFonts w:ascii="Arial" w:hAnsi="Arial"/>
+                <w:color w:val="222222"/>
+                <w:sz w:val="17"/>
+              </w:rPr>
+              <w:t>Building has sustained collapse of cantilevers, balconies, chimneys and parapets.</w:t>
+            </w:r>
+          </w:p>
+        </w:tc>
+        <w:tc>
+          <w:tcPr>
+            <w:tcW w:type="dxa" w:w="1152"/>
+            <w:shd w:fill="FFFFFF"/>
+            <w:tcMar>
+              <w:top w:w="50" w:type="dxa"/>
+              <w:bottom w:w="50" w:type="dxa"/>
+              <w:left w:w="80" w:type="dxa"/>
+              <w:right w:w="80" w:type="dxa"/>
+            </w:tcMar>
+          </w:tcPr>
+          <w:p>
+            <w:pPr>
+              <w:jc w:val="right"/>
+            </w:pPr>
+            <w:r>
+              <w:rPr>
+                <w:rFonts w:ascii="Arial" w:hAnsi="Arial"/>
+                <w:color w:val="222222"/>
+                <w:sz w:val="17"/>
+              </w:rPr>
+              <w:t>2</w:t>
+            </w:r>
+          </w:p>
+        </w:tc>
+        <w:tc>
+          <w:tcPr>
+            <w:tcW w:type="dxa" w:w="1152"/>
+            <w:shd w:fill="FFFFFF"/>
+            <w:tcMar>
+              <w:top w:w="50" w:type="dxa"/>
+              <w:bottom w:w="50" w:type="dxa"/>
+              <w:left w:w="80" w:type="dxa"/>
+              <w:right w:w="80" w:type="dxa"/>
+            </w:tcMar>
+          </w:tcPr>
+          <w:p>
+            <w:pPr>
+              <w:jc w:val="right"/>
+            </w:pPr>
+            <w:r>
+              <w:rPr>
+                <w:rFonts w:ascii="Arial" w:hAnsi="Arial"/>
+                <w:color w:val="222222"/>
+                <w:sz w:val="17"/>
+              </w:rPr>
+              <w:t>3.8%</w:t>
             </w:r>
           </w:p>
         </w:tc>
@@ -2553,7 +3620,7 @@
                 <w:color w:val="222222"/>
                 <w:sz w:val="17"/>
               </w:rPr>
-              <w:t>ADD_RC_04</w:t>
+              <w:t>ADD_RC_10</w:t>
             </w:r>
           </w:p>
         </w:tc>
@@ -2578,7 +3645,7 @@
                 <w:color w:val="222222"/>
                 <w:sz w:val="17"/>
               </w:rPr>
-              <w:t>Pancake collapse of multi-storey educational frame structure</w:t>
+              <w:t>Insufficient connection between RC elevator core wall and adjacent framing</w:t>
             </w:r>
           </w:p>
         </w:tc>
@@ -2603,7 +3670,7 @@
                 <w:color w:val="222222"/>
                 <w:sz w:val="17"/>
               </w:rPr>
-              <w:t>4</w:t>
+              <w:t>2</w:t>
             </w:r>
           </w:p>
         </w:tc>
@@ -2628,7 +3695,7 @@
                 <w:color w:val="222222"/>
                 <w:sz w:val="17"/>
               </w:rPr>
-              <w:t>8.7%</w:t>
+              <w:t>3.8%</w:t>
             </w:r>
           </w:p>
         </w:tc>
@@ -2680,7 +3747,7 @@
                 <w:color w:val="222222"/>
                 <w:sz w:val="17"/>
               </w:rPr>
-              <w:t>RC_RVS_8.4</w:t>
+              <w:t>RC_POST_2.3</w:t>
             </w:r>
           </w:p>
         </w:tc>
@@ -2705,7 +3772,7 @@
                 <w:color w:val="222222"/>
                 <w:sz w:val="17"/>
               </w:rPr>
-              <w:t>Building has unanchored water tanks on roof.</w:t>
+              <w:t>Building is resting on liquefied soil.</w:t>
             </w:r>
           </w:p>
         </w:tc>
@@ -2730,7 +3797,7 @@
                 <w:color w:val="222222"/>
                 <w:sz w:val="17"/>
               </w:rPr>
-              <w:t>4</w:t>
+              <w:t>2</w:t>
             </w:r>
           </w:p>
         </w:tc>
@@ -2755,261 +3822,7 @@
                 <w:color w:val="222222"/>
                 <w:sz w:val="17"/>
               </w:rPr>
-              <w:t>8.7%</w:t>
-            </w:r>
-          </w:p>
-        </w:tc>
-      </w:tr>
-      <w:tr>
-        <w:tc>
-          <w:tcPr>
-            <w:tcW w:type="dxa" w:w="1584"/>
-            <w:shd w:fill="F8F9FA"/>
-            <w:tcMar>
-              <w:top w:w="50" w:type="dxa"/>
-              <w:bottom w:w="50" w:type="dxa"/>
-              <w:left w:w="80" w:type="dxa"/>
-              <w:right w:w="80" w:type="dxa"/>
-            </w:tcMar>
-          </w:tcPr>
-          <w:p>
-            <w:pPr>
-              <w:jc w:val="left"/>
-            </w:pPr>
-            <w:r>
-              <w:rPr>
-                <w:rFonts w:ascii="Arial" w:hAnsi="Arial"/>
-                <w:color w:val="222222"/>
-                <w:sz w:val="17"/>
-              </w:rPr>
-              <w:t>RVS Primer</w:t>
-            </w:r>
-          </w:p>
-        </w:tc>
-        <w:tc>
-          <w:tcPr>
-            <w:tcW w:type="dxa" w:w="1728"/>
-            <w:shd w:fill="F8F9FA"/>
-            <w:tcMar>
-              <w:top w:w="50" w:type="dxa"/>
-              <w:bottom w:w="50" w:type="dxa"/>
-              <w:left w:w="80" w:type="dxa"/>
-              <w:right w:w="80" w:type="dxa"/>
-            </w:tcMar>
-          </w:tcPr>
-          <w:p>
-            <w:pPr>
-              <w:jc w:val="left"/>
-            </w:pPr>
-            <w:r>
-              <w:rPr>
-                <w:rFonts w:ascii="Arial" w:hAnsi="Arial"/>
-                <w:color w:val="222222"/>
-                <w:sz w:val="17"/>
-              </w:rPr>
-              <w:t>RC_POST_5.2</w:t>
-            </w:r>
-          </w:p>
-        </w:tc>
-        <w:tc>
-          <w:tcPr>
-            <w:tcW w:type="dxa" w:w="4752"/>
-            <w:shd w:fill="F8F9FA"/>
-            <w:tcMar>
-              <w:top w:w="50" w:type="dxa"/>
-              <w:bottom w:w="50" w:type="dxa"/>
-              <w:left w:w="80" w:type="dxa"/>
-              <w:right w:w="80" w:type="dxa"/>
-            </w:tcMar>
-          </w:tcPr>
-          <w:p>
-            <w:pPr>
-              <w:jc w:val="left"/>
-            </w:pPr>
-            <w:r>
-              <w:rPr>
-                <w:rFonts w:ascii="Arial" w:hAnsi="Arial"/>
-                <w:color w:val="222222"/>
-                <w:sz w:val="17"/>
-              </w:rPr>
-              <w:t>Building has water tanks on roof displaced from their supports.</w:t>
-            </w:r>
-          </w:p>
-        </w:tc>
-        <w:tc>
-          <w:tcPr>
-            <w:tcW w:type="dxa" w:w="1152"/>
-            <w:shd w:fill="F8F9FA"/>
-            <w:tcMar>
-              <w:top w:w="50" w:type="dxa"/>
-              <w:bottom w:w="50" w:type="dxa"/>
-              <w:left w:w="80" w:type="dxa"/>
-              <w:right w:w="80" w:type="dxa"/>
-            </w:tcMar>
-          </w:tcPr>
-          <w:p>
-            <w:pPr>
-              <w:jc w:val="right"/>
-            </w:pPr>
-            <w:r>
-              <w:rPr>
-                <w:rFonts w:ascii="Arial" w:hAnsi="Arial"/>
-                <w:color w:val="222222"/>
-                <w:sz w:val="17"/>
-              </w:rPr>
-              <w:t>4</w:t>
-            </w:r>
-          </w:p>
-        </w:tc>
-        <w:tc>
-          <w:tcPr>
-            <w:tcW w:type="dxa" w:w="1152"/>
-            <w:shd w:fill="F8F9FA"/>
-            <w:tcMar>
-              <w:top w:w="50" w:type="dxa"/>
-              <w:bottom w:w="50" w:type="dxa"/>
-              <w:left w:w="80" w:type="dxa"/>
-              <w:right w:w="80" w:type="dxa"/>
-            </w:tcMar>
-          </w:tcPr>
-          <w:p>
-            <w:pPr>
-              <w:jc w:val="right"/>
-            </w:pPr>
-            <w:r>
-              <w:rPr>
-                <w:rFonts w:ascii="Arial" w:hAnsi="Arial"/>
-                <w:color w:val="222222"/>
-                <w:sz w:val="17"/>
-              </w:rPr>
-              <w:t>8.7%</w:t>
-            </w:r>
-          </w:p>
-        </w:tc>
-      </w:tr>
-      <w:tr>
-        <w:tc>
-          <w:tcPr>
-            <w:tcW w:type="dxa" w:w="1584"/>
-            <w:shd w:fill="FFFFFF"/>
-            <w:tcMar>
-              <w:top w:w="50" w:type="dxa"/>
-              <w:bottom w:w="50" w:type="dxa"/>
-              <w:left w:w="80" w:type="dxa"/>
-              <w:right w:w="80" w:type="dxa"/>
-            </w:tcMar>
-          </w:tcPr>
-          <w:p>
-            <w:pPr>
-              <w:jc w:val="left"/>
-            </w:pPr>
-            <w:r>
-              <w:rPr>
-                <w:rFonts w:ascii="Arial" w:hAnsi="Arial"/>
-                <w:color w:val="222222"/>
-                <w:sz w:val="17"/>
-              </w:rPr>
-              <w:t>RVS Primer</w:t>
-            </w:r>
-          </w:p>
-        </w:tc>
-        <w:tc>
-          <w:tcPr>
-            <w:tcW w:type="dxa" w:w="1728"/>
-            <w:shd w:fill="FFFFFF"/>
-            <w:tcMar>
-              <w:top w:w="50" w:type="dxa"/>
-              <w:bottom w:w="50" w:type="dxa"/>
-              <w:left w:w="80" w:type="dxa"/>
-              <w:right w:w="80" w:type="dxa"/>
-            </w:tcMar>
-          </w:tcPr>
-          <w:p>
-            <w:pPr>
-              <w:jc w:val="left"/>
-            </w:pPr>
-            <w:r>
-              <w:rPr>
-                <w:rFonts w:ascii="Arial" w:hAnsi="Arial"/>
-                <w:color w:val="222222"/>
-                <w:sz w:val="17"/>
-              </w:rPr>
-              <w:t>RC_RVS_9.1</w:t>
-            </w:r>
-          </w:p>
-        </w:tc>
-        <w:tc>
-          <w:tcPr>
-            <w:tcW w:type="dxa" w:w="4752"/>
-            <w:shd w:fill="FFFFFF"/>
-            <w:tcMar>
-              <w:top w:w="50" w:type="dxa"/>
-              <w:bottom w:w="50" w:type="dxa"/>
-              <w:left w:w="80" w:type="dxa"/>
-              <w:right w:w="80" w:type="dxa"/>
-            </w:tcMar>
-          </w:tcPr>
-          <w:p>
-            <w:pPr>
-              <w:jc w:val="left"/>
-            </w:pPr>
-            <w:r>
-              <w:rPr>
-                <w:rFonts w:ascii="Arial" w:hAnsi="Arial"/>
-                <w:color w:val="222222"/>
-                <w:sz w:val="17"/>
-              </w:rPr>
-              <w:t>Building has longitudinal cracks and/or spalling in Beams and Columns.</w:t>
-            </w:r>
-          </w:p>
-        </w:tc>
-        <w:tc>
-          <w:tcPr>
-            <w:tcW w:type="dxa" w:w="1152"/>
-            <w:shd w:fill="FFFFFF"/>
-            <w:tcMar>
-              <w:top w:w="50" w:type="dxa"/>
-              <w:bottom w:w="50" w:type="dxa"/>
-              <w:left w:w="80" w:type="dxa"/>
-              <w:right w:w="80" w:type="dxa"/>
-            </w:tcMar>
-          </w:tcPr>
-          <w:p>
-            <w:pPr>
-              <w:jc w:val="right"/>
-            </w:pPr>
-            <w:r>
-              <w:rPr>
-                <w:rFonts w:ascii="Arial" w:hAnsi="Arial"/>
-                <w:color w:val="222222"/>
-                <w:sz w:val="17"/>
-              </w:rPr>
-              <w:t>4</w:t>
-            </w:r>
-          </w:p>
-        </w:tc>
-        <w:tc>
-          <w:tcPr>
-            <w:tcW w:type="dxa" w:w="1152"/>
-            <w:shd w:fill="FFFFFF"/>
-            <w:tcMar>
-              <w:top w:w="50" w:type="dxa"/>
-              <w:bottom w:w="50" w:type="dxa"/>
-              <w:left w:w="80" w:type="dxa"/>
-              <w:right w:w="80" w:type="dxa"/>
-            </w:tcMar>
-          </w:tcPr>
-          <w:p>
-            <w:pPr>
-              <w:jc w:val="right"/>
-            </w:pPr>
-            <w:r>
-              <w:rPr>
-                <w:rFonts w:ascii="Arial" w:hAnsi="Arial"/>
-                <w:color w:val="222222"/>
-                <w:sz w:val="17"/>
-              </w:rPr>
-              <w:t>8.7%</w:t>
+              <w:t>3.8%</w:t>
             </w:r>
           </w:p>
         </w:tc>
@@ -3062,7 +3875,7 @@
                 <w:color w:val="222222"/>
                 <w:sz w:val="17"/>
               </w:rPr>
-              <w:t>ADD_RC_08</w:t>
+              <w:t>ADD_RC_01</w:t>
             </w:r>
           </w:p>
         </w:tc>
@@ -3087,7 +3900,7 @@
                 <w:color w:val="222222"/>
                 <w:sz w:val="17"/>
               </w:rPr>
-              <w:t>Improper post-earthquake column jacketing not extended to foundations or beam joints</w:t>
+              <w:t>Inadequate lap length in longitudinal column reinforcement</w:t>
             </w:r>
           </w:p>
         </w:tc>
@@ -3112,7 +3925,7 @@
                 <w:color w:val="222222"/>
                 <w:sz w:val="17"/>
               </w:rPr>
-              <w:t>4</w:t>
+              <w:t>1</w:t>
             </w:r>
           </w:p>
         </w:tc>
@@ -3137,7 +3950,7 @@
                 <w:color w:val="222222"/>
                 <w:sz w:val="17"/>
               </w:rPr>
-              <w:t>8.7%</w:t>
+              <w:t>1.9%</w:t>
             </w:r>
           </w:p>
         </w:tc>
@@ -3190,7 +4003,7 @@
                 <w:color w:val="222222"/>
                 <w:sz w:val="17"/>
               </w:rPr>
-              <w:t>ADD_RC_06</w:t>
+              <w:t>ADD_RC_09</w:t>
             </w:r>
           </w:p>
         </w:tc>
@@ -3215,7 +4028,7 @@
                 <w:color w:val="222222"/>
                 <w:sz w:val="17"/>
               </w:rPr>
-              <w:t>Dislodging of weakly connected overhead water tank appendages</w:t>
+              <w:t>Shear cracks in cantilever stub beam supporting floating columns</w:t>
             </w:r>
           </w:p>
         </w:tc>
@@ -3240,7 +4053,7 @@
                 <w:color w:val="222222"/>
                 <w:sz w:val="17"/>
               </w:rPr>
-              <w:t>3</w:t>
+              <w:t>1</w:t>
             </w:r>
           </w:p>
         </w:tc>
@@ -3265,7 +4078,7 @@
                 <w:color w:val="222222"/>
                 <w:sz w:val="17"/>
               </w:rPr>
-              <w:t>6.5%</w:t>
+              <w:t>1.9%</w:t>
             </w:r>
           </w:p>
         </w:tc>
@@ -3289,10 +4102,11 @@
             <w:r>
               <w:rPr>
                 <w:rFonts w:ascii="Arial" w:hAnsi="Arial"/>
-                <w:color w:val="222222"/>
+                <w:b/>
+                <w:color w:val="D95F02"/>
                 <w:sz w:val="17"/>
               </w:rPr>
-              <w:t>RVS Primer</w:t>
+              <w:t>Additional</w:t>
             </w:r>
           </w:p>
         </w:tc>
@@ -3317,7 +4131,7 @@
                 <w:color w:val="222222"/>
                 <w:sz w:val="17"/>
               </w:rPr>
-              <w:t>RC_RVS_3.5</w:t>
+              <w:t>ADD_RC_11</w:t>
             </w:r>
           </w:p>
         </w:tc>
@@ -3342,7 +4156,7 @@
                 <w:color w:val="222222"/>
                 <w:sz w:val="17"/>
               </w:rPr>
-              <w:t>Building has RC frame with Floating Columns.</w:t>
+              <w:t>Dislodgement of precast roof panels atop precast frame due to inadequate connections</w:t>
             </w:r>
           </w:p>
         </w:tc>
@@ -3367,7 +4181,7 @@
                 <w:color w:val="222222"/>
                 <w:sz w:val="17"/>
               </w:rPr>
-              <w:t>2</w:t>
+              <w:t>1</w:t>
             </w:r>
           </w:p>
         </w:tc>
@@ -3392,515 +4206,7 @@
                 <w:color w:val="222222"/>
                 <w:sz w:val="17"/>
               </w:rPr>
-              <w:t>4.3%</w:t>
-            </w:r>
-          </w:p>
-        </w:tc>
-      </w:tr>
-      <w:tr>
-        <w:tc>
-          <w:tcPr>
-            <w:tcW w:type="dxa" w:w="1584"/>
-            <w:shd w:fill="FFFFFF"/>
-            <w:tcMar>
-              <w:top w:w="50" w:type="dxa"/>
-              <w:bottom w:w="50" w:type="dxa"/>
-              <w:left w:w="80" w:type="dxa"/>
-              <w:right w:w="80" w:type="dxa"/>
-            </w:tcMar>
-          </w:tcPr>
-          <w:p>
-            <w:pPr>
-              <w:jc w:val="left"/>
-            </w:pPr>
-            <w:r>
-              <w:rPr>
-                <w:rFonts w:ascii="Arial" w:hAnsi="Arial"/>
-                <w:color w:val="222222"/>
-                <w:sz w:val="17"/>
-              </w:rPr>
-              <w:t>RVS Primer</w:t>
-            </w:r>
-          </w:p>
-        </w:tc>
-        <w:tc>
-          <w:tcPr>
-            <w:tcW w:type="dxa" w:w="1728"/>
-            <w:shd w:fill="FFFFFF"/>
-            <w:tcMar>
-              <w:top w:w="50" w:type="dxa"/>
-              <w:bottom w:w="50" w:type="dxa"/>
-              <w:left w:w="80" w:type="dxa"/>
-              <w:right w:w="80" w:type="dxa"/>
-            </w:tcMar>
-          </w:tcPr>
-          <w:p>
-            <w:pPr>
-              <w:jc w:val="left"/>
-            </w:pPr>
-            <w:r>
-              <w:rPr>
-                <w:rFonts w:ascii="Arial" w:hAnsi="Arial"/>
-                <w:color w:val="222222"/>
-                <w:sz w:val="17"/>
-              </w:rPr>
-              <w:t>RC_RVS_7.3</w:t>
-            </w:r>
-          </w:p>
-        </w:tc>
-        <w:tc>
-          <w:tcPr>
-            <w:tcW w:type="dxa" w:w="4752"/>
-            <w:shd w:fill="FFFFFF"/>
-            <w:tcMar>
-              <w:top w:w="50" w:type="dxa"/>
-              <w:bottom w:w="50" w:type="dxa"/>
-              <w:left w:w="80" w:type="dxa"/>
-              <w:right w:w="80" w:type="dxa"/>
-            </w:tcMar>
-          </w:tcPr>
-          <w:p>
-            <w:pPr>
-              <w:jc w:val="left"/>
-            </w:pPr>
-            <w:r>
-              <w:rPr>
-                <w:rFonts w:ascii="Arial" w:hAnsi="Arial"/>
-                <w:color w:val="222222"/>
-                <w:sz w:val="17"/>
-              </w:rPr>
-              <w:t>Building has large or heavy cantilever balconies or sunshades.</w:t>
-            </w:r>
-          </w:p>
-        </w:tc>
-        <w:tc>
-          <w:tcPr>
-            <w:tcW w:type="dxa" w:w="1152"/>
-            <w:shd w:fill="FFFFFF"/>
-            <w:tcMar>
-              <w:top w:w="50" w:type="dxa"/>
-              <w:bottom w:w="50" w:type="dxa"/>
-              <w:left w:w="80" w:type="dxa"/>
-              <w:right w:w="80" w:type="dxa"/>
-            </w:tcMar>
-          </w:tcPr>
-          <w:p>
-            <w:pPr>
-              <w:jc w:val="right"/>
-            </w:pPr>
-            <w:r>
-              <w:rPr>
-                <w:rFonts w:ascii="Arial" w:hAnsi="Arial"/>
-                <w:color w:val="222222"/>
-                <w:sz w:val="17"/>
-              </w:rPr>
-              <w:t>2</w:t>
-            </w:r>
-          </w:p>
-        </w:tc>
-        <w:tc>
-          <w:tcPr>
-            <w:tcW w:type="dxa" w:w="1152"/>
-            <w:shd w:fill="FFFFFF"/>
-            <w:tcMar>
-              <w:top w:w="50" w:type="dxa"/>
-              <w:bottom w:w="50" w:type="dxa"/>
-              <w:left w:w="80" w:type="dxa"/>
-              <w:right w:w="80" w:type="dxa"/>
-            </w:tcMar>
-          </w:tcPr>
-          <w:p>
-            <w:pPr>
-              <w:jc w:val="right"/>
-            </w:pPr>
-            <w:r>
-              <w:rPr>
-                <w:rFonts w:ascii="Arial" w:hAnsi="Arial"/>
-                <w:color w:val="222222"/>
-                <w:sz w:val="17"/>
-              </w:rPr>
-              <w:t>4.3%</w:t>
-            </w:r>
-          </w:p>
-        </w:tc>
-      </w:tr>
-      <w:tr>
-        <w:tc>
-          <w:tcPr>
-            <w:tcW w:type="dxa" w:w="1584"/>
-            <w:shd w:fill="F8F9FA"/>
-            <w:tcMar>
-              <w:top w:w="50" w:type="dxa"/>
-              <w:bottom w:w="50" w:type="dxa"/>
-              <w:left w:w="80" w:type="dxa"/>
-              <w:right w:w="80" w:type="dxa"/>
-            </w:tcMar>
-          </w:tcPr>
-          <w:p>
-            <w:pPr>
-              <w:jc w:val="left"/>
-            </w:pPr>
-            <w:r>
-              <w:rPr>
-                <w:rFonts w:ascii="Arial" w:hAnsi="Arial"/>
-                <w:color w:val="222222"/>
-                <w:sz w:val="17"/>
-              </w:rPr>
-              <w:t>RVS Primer</w:t>
-            </w:r>
-          </w:p>
-        </w:tc>
-        <w:tc>
-          <w:tcPr>
-            <w:tcW w:type="dxa" w:w="1728"/>
-            <w:shd w:fill="F8F9FA"/>
-            <w:tcMar>
-              <w:top w:w="50" w:type="dxa"/>
-              <w:bottom w:w="50" w:type="dxa"/>
-              <w:left w:w="80" w:type="dxa"/>
-              <w:right w:w="80" w:type="dxa"/>
-            </w:tcMar>
-          </w:tcPr>
-          <w:p>
-            <w:pPr>
-              <w:jc w:val="left"/>
-            </w:pPr>
-            <w:r>
-              <w:rPr>
-                <w:rFonts w:ascii="Arial" w:hAnsi="Arial"/>
-                <w:color w:val="222222"/>
-                <w:sz w:val="17"/>
-              </w:rPr>
-              <w:t>RC_POST_3.4</w:t>
-            </w:r>
-          </w:p>
-        </w:tc>
-        <w:tc>
-          <w:tcPr>
-            <w:tcW w:type="dxa" w:w="4752"/>
-            <w:shd w:fill="F8F9FA"/>
-            <w:tcMar>
-              <w:top w:w="50" w:type="dxa"/>
-              <w:bottom w:w="50" w:type="dxa"/>
-              <w:left w:w="80" w:type="dxa"/>
-              <w:right w:w="80" w:type="dxa"/>
-            </w:tcMar>
-          </w:tcPr>
-          <w:p>
-            <w:pPr>
-              <w:jc w:val="left"/>
-            </w:pPr>
-            <w:r>
-              <w:rPr>
-                <w:rFonts w:ascii="Arial" w:hAnsi="Arial"/>
-                <w:color w:val="222222"/>
-                <w:sz w:val="17"/>
-              </w:rPr>
-              <w:t>Building has Floating Columns with cracked supporting beams.</w:t>
-            </w:r>
-          </w:p>
-        </w:tc>
-        <w:tc>
-          <w:tcPr>
-            <w:tcW w:type="dxa" w:w="1152"/>
-            <w:shd w:fill="F8F9FA"/>
-            <w:tcMar>
-              <w:top w:w="50" w:type="dxa"/>
-              <w:bottom w:w="50" w:type="dxa"/>
-              <w:left w:w="80" w:type="dxa"/>
-              <w:right w:w="80" w:type="dxa"/>
-            </w:tcMar>
-          </w:tcPr>
-          <w:p>
-            <w:pPr>
-              <w:jc w:val="right"/>
-            </w:pPr>
-            <w:r>
-              <w:rPr>
-                <w:rFonts w:ascii="Arial" w:hAnsi="Arial"/>
-                <w:color w:val="222222"/>
-                <w:sz w:val="17"/>
-              </w:rPr>
-              <w:t>2</w:t>
-            </w:r>
-          </w:p>
-        </w:tc>
-        <w:tc>
-          <w:tcPr>
-            <w:tcW w:type="dxa" w:w="1152"/>
-            <w:shd w:fill="F8F9FA"/>
-            <w:tcMar>
-              <w:top w:w="50" w:type="dxa"/>
-              <w:bottom w:w="50" w:type="dxa"/>
-              <w:left w:w="80" w:type="dxa"/>
-              <w:right w:w="80" w:type="dxa"/>
-            </w:tcMar>
-          </w:tcPr>
-          <w:p>
-            <w:pPr>
-              <w:jc w:val="right"/>
-            </w:pPr>
-            <w:r>
-              <w:rPr>
-                <w:rFonts w:ascii="Arial" w:hAnsi="Arial"/>
-                <w:color w:val="222222"/>
-                <w:sz w:val="17"/>
-              </w:rPr>
-              <w:t>4.3%</w:t>
-            </w:r>
-          </w:p>
-        </w:tc>
-      </w:tr>
-      <w:tr>
-        <w:tc>
-          <w:tcPr>
-            <w:tcW w:type="dxa" w:w="1584"/>
-            <w:shd w:fill="FFFFFF"/>
-            <w:tcMar>
-              <w:top w:w="50" w:type="dxa"/>
-              <w:bottom w:w="50" w:type="dxa"/>
-              <w:left w:w="80" w:type="dxa"/>
-              <w:right w:w="80" w:type="dxa"/>
-            </w:tcMar>
-          </w:tcPr>
-          <w:p>
-            <w:pPr>
-              <w:jc w:val="left"/>
-            </w:pPr>
-            <w:r>
-              <w:rPr>
-                <w:rFonts w:ascii="Arial" w:hAnsi="Arial"/>
-                <w:color w:val="222222"/>
-                <w:sz w:val="17"/>
-              </w:rPr>
-              <w:t>RVS Primer</w:t>
-            </w:r>
-          </w:p>
-        </w:tc>
-        <w:tc>
-          <w:tcPr>
-            <w:tcW w:type="dxa" w:w="1728"/>
-            <w:shd w:fill="FFFFFF"/>
-            <w:tcMar>
-              <w:top w:w="50" w:type="dxa"/>
-              <w:bottom w:w="50" w:type="dxa"/>
-              <w:left w:w="80" w:type="dxa"/>
-              <w:right w:w="80" w:type="dxa"/>
-            </w:tcMar>
-          </w:tcPr>
-          <w:p>
-            <w:pPr>
-              <w:jc w:val="left"/>
-            </w:pPr>
-            <w:r>
-              <w:rPr>
-                <w:rFonts w:ascii="Arial" w:hAnsi="Arial"/>
-                <w:color w:val="222222"/>
-                <w:sz w:val="17"/>
-              </w:rPr>
-              <w:t>RC_POST_3.5</w:t>
-            </w:r>
-          </w:p>
-        </w:tc>
-        <w:tc>
-          <w:tcPr>
-            <w:tcW w:type="dxa" w:w="4752"/>
-            <w:shd w:fill="FFFFFF"/>
-            <w:tcMar>
-              <w:top w:w="50" w:type="dxa"/>
-              <w:bottom w:w="50" w:type="dxa"/>
-              <w:left w:w="80" w:type="dxa"/>
-              <w:right w:w="80" w:type="dxa"/>
-            </w:tcMar>
-          </w:tcPr>
-          <w:p>
-            <w:pPr>
-              <w:jc w:val="left"/>
-            </w:pPr>
-            <w:r>
-              <w:rPr>
-                <w:rFonts w:ascii="Arial" w:hAnsi="Arial"/>
-                <w:color w:val="222222"/>
-                <w:sz w:val="17"/>
-              </w:rPr>
-              <w:t>Building has main load resisting columns with shear cracks.</w:t>
-            </w:r>
-          </w:p>
-        </w:tc>
-        <w:tc>
-          <w:tcPr>
-            <w:tcW w:type="dxa" w:w="1152"/>
-            <w:shd w:fill="FFFFFF"/>
-            <w:tcMar>
-              <w:top w:w="50" w:type="dxa"/>
-              <w:bottom w:w="50" w:type="dxa"/>
-              <w:left w:w="80" w:type="dxa"/>
-              <w:right w:w="80" w:type="dxa"/>
-            </w:tcMar>
-          </w:tcPr>
-          <w:p>
-            <w:pPr>
-              <w:jc w:val="right"/>
-            </w:pPr>
-            <w:r>
-              <w:rPr>
-                <w:rFonts w:ascii="Arial" w:hAnsi="Arial"/>
-                <w:color w:val="222222"/>
-                <w:sz w:val="17"/>
-              </w:rPr>
-              <w:t>2</w:t>
-            </w:r>
-          </w:p>
-        </w:tc>
-        <w:tc>
-          <w:tcPr>
-            <w:tcW w:type="dxa" w:w="1152"/>
-            <w:shd w:fill="FFFFFF"/>
-            <w:tcMar>
-              <w:top w:w="50" w:type="dxa"/>
-              <w:bottom w:w="50" w:type="dxa"/>
-              <w:left w:w="80" w:type="dxa"/>
-              <w:right w:w="80" w:type="dxa"/>
-            </w:tcMar>
-          </w:tcPr>
-          <w:p>
-            <w:pPr>
-              <w:jc w:val="right"/>
-            </w:pPr>
-            <w:r>
-              <w:rPr>
-                <w:rFonts w:ascii="Arial" w:hAnsi="Arial"/>
-                <w:color w:val="222222"/>
-                <w:sz w:val="17"/>
-              </w:rPr>
-              <w:t>4.3%</w:t>
-            </w:r>
-          </w:p>
-        </w:tc>
-      </w:tr>
-      <w:tr>
-        <w:tc>
-          <w:tcPr>
-            <w:tcW w:type="dxa" w:w="1584"/>
-            <w:shd w:fill="F8F9FA"/>
-            <w:tcMar>
-              <w:top w:w="50" w:type="dxa"/>
-              <w:bottom w:w="50" w:type="dxa"/>
-              <w:left w:w="80" w:type="dxa"/>
-              <w:right w:w="80" w:type="dxa"/>
-            </w:tcMar>
-          </w:tcPr>
-          <w:p>
-            <w:pPr>
-              <w:jc w:val="left"/>
-            </w:pPr>
-            <w:r>
-              <w:rPr>
-                <w:rFonts w:ascii="Arial" w:hAnsi="Arial"/>
-                <w:color w:val="222222"/>
-                <w:sz w:val="17"/>
-              </w:rPr>
-              <w:t>RVS Primer</w:t>
-            </w:r>
-          </w:p>
-        </w:tc>
-        <w:tc>
-          <w:tcPr>
-            <w:tcW w:type="dxa" w:w="1728"/>
-            <w:shd w:fill="F8F9FA"/>
-            <w:tcMar>
-              <w:top w:w="50" w:type="dxa"/>
-              <w:bottom w:w="50" w:type="dxa"/>
-              <w:left w:w="80" w:type="dxa"/>
-              <w:right w:w="80" w:type="dxa"/>
-            </w:tcMar>
-          </w:tcPr>
-          <w:p>
-            <w:pPr>
-              <w:jc w:val="left"/>
-            </w:pPr>
-            <w:r>
-              <w:rPr>
-                <w:rFonts w:ascii="Arial" w:hAnsi="Arial"/>
-                <w:color w:val="222222"/>
-                <w:sz w:val="17"/>
-              </w:rPr>
-              <w:t>RC_POST_5.1</w:t>
-            </w:r>
-          </w:p>
-        </w:tc>
-        <w:tc>
-          <w:tcPr>
-            <w:tcW w:type="dxa" w:w="4752"/>
-            <w:shd w:fill="F8F9FA"/>
-            <w:tcMar>
-              <w:top w:w="50" w:type="dxa"/>
-              <w:bottom w:w="50" w:type="dxa"/>
-              <w:left w:w="80" w:type="dxa"/>
-              <w:right w:w="80" w:type="dxa"/>
-            </w:tcMar>
-          </w:tcPr>
-          <w:p>
-            <w:pPr>
-              <w:jc w:val="left"/>
-            </w:pPr>
-            <w:r>
-              <w:rPr>
-                <w:rFonts w:ascii="Arial" w:hAnsi="Arial"/>
-                <w:color w:val="222222"/>
-                <w:sz w:val="17"/>
-              </w:rPr>
-              <w:t>Building has sustained collapse of cantilevers, balconies, chimneys and parapets.</w:t>
-            </w:r>
-          </w:p>
-        </w:tc>
-        <w:tc>
-          <w:tcPr>
-            <w:tcW w:type="dxa" w:w="1152"/>
-            <w:shd w:fill="F8F9FA"/>
-            <w:tcMar>
-              <w:top w:w="50" w:type="dxa"/>
-              <w:bottom w:w="50" w:type="dxa"/>
-              <w:left w:w="80" w:type="dxa"/>
-              <w:right w:w="80" w:type="dxa"/>
-            </w:tcMar>
-          </w:tcPr>
-          <w:p>
-            <w:pPr>
-              <w:jc w:val="right"/>
-            </w:pPr>
-            <w:r>
-              <w:rPr>
-                <w:rFonts w:ascii="Arial" w:hAnsi="Arial"/>
-                <w:color w:val="222222"/>
-                <w:sz w:val="17"/>
-              </w:rPr>
-              <w:t>2</w:t>
-            </w:r>
-          </w:p>
-        </w:tc>
-        <w:tc>
-          <w:tcPr>
-            <w:tcW w:type="dxa" w:w="1152"/>
-            <w:shd w:fill="F8F9FA"/>
-            <w:tcMar>
-              <w:top w:w="50" w:type="dxa"/>
-              <w:bottom w:w="50" w:type="dxa"/>
-              <w:left w:w="80" w:type="dxa"/>
-              <w:right w:w="80" w:type="dxa"/>
-            </w:tcMar>
-          </w:tcPr>
-          <w:p>
-            <w:pPr>
-              <w:jc w:val="right"/>
-            </w:pPr>
-            <w:r>
-              <w:rPr>
-                <w:rFonts w:ascii="Arial" w:hAnsi="Arial"/>
-                <w:color w:val="222222"/>
-                <w:sz w:val="17"/>
-              </w:rPr>
-              <w:t>4.3%</w:t>
+              <w:t>1.9%</w:t>
             </w:r>
           </w:p>
         </w:tc>
@@ -3953,7 +4259,7 @@
                 <w:color w:val="222222"/>
                 <w:sz w:val="17"/>
               </w:rPr>
-              <w:t>ADD_RC_10</w:t>
+              <w:t>ADD_GEN_02</w:t>
             </w:r>
           </w:p>
         </w:tc>
@@ -3978,262 +4284,7 @@
                 <w:color w:val="222222"/>
                 <w:sz w:val="17"/>
               </w:rPr>
-              <w:t>Insufficient connection between RC elevator core wall and adjacent framing</w:t>
-            </w:r>
-          </w:p>
-        </w:tc>
-        <w:tc>
-          <w:tcPr>
-            <w:tcW w:type="dxa" w:w="1152"/>
-            <w:shd w:fill="FFFFFF"/>
-            <w:tcMar>
-              <w:top w:w="50" w:type="dxa"/>
-              <w:bottom w:w="50" w:type="dxa"/>
-              <w:left w:w="80" w:type="dxa"/>
-              <w:right w:w="80" w:type="dxa"/>
-            </w:tcMar>
-          </w:tcPr>
-          <w:p>
-            <w:pPr>
-              <w:jc w:val="right"/>
-            </w:pPr>
-            <w:r>
-              <w:rPr>
-                <w:rFonts w:ascii="Arial" w:hAnsi="Arial"/>
-                <w:color w:val="222222"/>
-                <w:sz w:val="17"/>
-              </w:rPr>
-              <w:t>2</w:t>
-            </w:r>
-          </w:p>
-        </w:tc>
-        <w:tc>
-          <w:tcPr>
-            <w:tcW w:type="dxa" w:w="1152"/>
-            <w:shd w:fill="FFFFFF"/>
-            <w:tcMar>
-              <w:top w:w="50" w:type="dxa"/>
-              <w:bottom w:w="50" w:type="dxa"/>
-              <w:left w:w="80" w:type="dxa"/>
-              <w:right w:w="80" w:type="dxa"/>
-            </w:tcMar>
-          </w:tcPr>
-          <w:p>
-            <w:pPr>
-              <w:jc w:val="right"/>
-            </w:pPr>
-            <w:r>
-              <w:rPr>
-                <w:rFonts w:ascii="Arial" w:hAnsi="Arial"/>
-                <w:color w:val="222222"/>
-                <w:sz w:val="17"/>
-              </w:rPr>
-              <w:t>4.3%</w:t>
-            </w:r>
-          </w:p>
-        </w:tc>
-      </w:tr>
-      <w:tr>
-        <w:tc>
-          <w:tcPr>
-            <w:tcW w:type="dxa" w:w="1584"/>
-            <w:shd w:fill="F8F9FA"/>
-            <w:tcMar>
-              <w:top w:w="50" w:type="dxa"/>
-              <w:bottom w:w="50" w:type="dxa"/>
-              <w:left w:w="80" w:type="dxa"/>
-              <w:right w:w="80" w:type="dxa"/>
-            </w:tcMar>
-          </w:tcPr>
-          <w:p>
-            <w:pPr>
-              <w:jc w:val="left"/>
-            </w:pPr>
-            <w:r>
-              <w:rPr>
-                <w:rFonts w:ascii="Arial" w:hAnsi="Arial"/>
-                <w:color w:val="222222"/>
-                <w:sz w:val="17"/>
-              </w:rPr>
-              <w:t>RVS Primer</w:t>
-            </w:r>
-          </w:p>
-        </w:tc>
-        <w:tc>
-          <w:tcPr>
-            <w:tcW w:type="dxa" w:w="1728"/>
-            <w:shd w:fill="F8F9FA"/>
-            <w:tcMar>
-              <w:top w:w="50" w:type="dxa"/>
-              <w:bottom w:w="50" w:type="dxa"/>
-              <w:left w:w="80" w:type="dxa"/>
-              <w:right w:w="80" w:type="dxa"/>
-            </w:tcMar>
-          </w:tcPr>
-          <w:p>
-            <w:pPr>
-              <w:jc w:val="left"/>
-            </w:pPr>
-            <w:r>
-              <w:rPr>
-                <w:rFonts w:ascii="Arial" w:hAnsi="Arial"/>
-                <w:color w:val="222222"/>
-                <w:sz w:val="17"/>
-              </w:rPr>
-              <w:t>RC_POST_2.3</w:t>
-            </w:r>
-          </w:p>
-        </w:tc>
-        <w:tc>
-          <w:tcPr>
-            <w:tcW w:type="dxa" w:w="4752"/>
-            <w:shd w:fill="F8F9FA"/>
-            <w:tcMar>
-              <w:top w:w="50" w:type="dxa"/>
-              <w:bottom w:w="50" w:type="dxa"/>
-              <w:left w:w="80" w:type="dxa"/>
-              <w:right w:w="80" w:type="dxa"/>
-            </w:tcMar>
-          </w:tcPr>
-          <w:p>
-            <w:pPr>
-              <w:jc w:val="left"/>
-            </w:pPr>
-            <w:r>
-              <w:rPr>
-                <w:rFonts w:ascii="Arial" w:hAnsi="Arial"/>
-                <w:color w:val="222222"/>
-                <w:sz w:val="17"/>
-              </w:rPr>
-              <w:t>Building is resting on liquefied soil.</w:t>
-            </w:r>
-          </w:p>
-        </w:tc>
-        <w:tc>
-          <w:tcPr>
-            <w:tcW w:type="dxa" w:w="1152"/>
-            <w:shd w:fill="F8F9FA"/>
-            <w:tcMar>
-              <w:top w:w="50" w:type="dxa"/>
-              <w:bottom w:w="50" w:type="dxa"/>
-              <w:left w:w="80" w:type="dxa"/>
-              <w:right w:w="80" w:type="dxa"/>
-            </w:tcMar>
-          </w:tcPr>
-          <w:p>
-            <w:pPr>
-              <w:jc w:val="right"/>
-            </w:pPr>
-            <w:r>
-              <w:rPr>
-                <w:rFonts w:ascii="Arial" w:hAnsi="Arial"/>
-                <w:color w:val="222222"/>
-                <w:sz w:val="17"/>
-              </w:rPr>
-              <w:t>2</w:t>
-            </w:r>
-          </w:p>
-        </w:tc>
-        <w:tc>
-          <w:tcPr>
-            <w:tcW w:type="dxa" w:w="1152"/>
-            <w:shd w:fill="F8F9FA"/>
-            <w:tcMar>
-              <w:top w:w="50" w:type="dxa"/>
-              <w:bottom w:w="50" w:type="dxa"/>
-              <w:left w:w="80" w:type="dxa"/>
-              <w:right w:w="80" w:type="dxa"/>
-            </w:tcMar>
-          </w:tcPr>
-          <w:p>
-            <w:pPr>
-              <w:jc w:val="right"/>
-            </w:pPr>
-            <w:r>
-              <w:rPr>
-                <w:rFonts w:ascii="Arial" w:hAnsi="Arial"/>
-                <w:color w:val="222222"/>
-                <w:sz w:val="17"/>
-              </w:rPr>
-              <w:t>4.3%</w:t>
-            </w:r>
-          </w:p>
-        </w:tc>
-      </w:tr>
-      <w:tr>
-        <w:tc>
-          <w:tcPr>
-            <w:tcW w:type="dxa" w:w="1584"/>
-            <w:shd w:fill="FFFFFF"/>
-            <w:tcMar>
-              <w:top w:w="50" w:type="dxa"/>
-              <w:bottom w:w="50" w:type="dxa"/>
-              <w:left w:w="80" w:type="dxa"/>
-              <w:right w:w="80" w:type="dxa"/>
-            </w:tcMar>
-          </w:tcPr>
-          <w:p>
-            <w:pPr>
-              <w:jc w:val="left"/>
-            </w:pPr>
-            <w:r>
-              <w:rPr>
-                <w:rFonts w:ascii="Arial" w:hAnsi="Arial"/>
-                <w:b/>
-                <w:color w:val="D95F02"/>
-                <w:sz w:val="17"/>
-              </w:rPr>
-              <w:t>Additional</w:t>
-            </w:r>
-          </w:p>
-        </w:tc>
-        <w:tc>
-          <w:tcPr>
-            <w:tcW w:type="dxa" w:w="1728"/>
-            <w:shd w:fill="FFFFFF"/>
-            <w:tcMar>
-              <w:top w:w="50" w:type="dxa"/>
-              <w:bottom w:w="50" w:type="dxa"/>
-              <w:left w:w="80" w:type="dxa"/>
-              <w:right w:w="80" w:type="dxa"/>
-            </w:tcMar>
-          </w:tcPr>
-          <w:p>
-            <w:pPr>
-              <w:jc w:val="left"/>
-            </w:pPr>
-            <w:r>
-              <w:rPr>
-                <w:rFonts w:ascii="Arial" w:hAnsi="Arial"/>
-                <w:color w:val="222222"/>
-                <w:sz w:val="17"/>
-              </w:rPr>
-              <w:t>ADD_RC_01</w:t>
-            </w:r>
-          </w:p>
-        </w:tc>
-        <w:tc>
-          <w:tcPr>
-            <w:tcW w:type="dxa" w:w="4752"/>
-            <w:shd w:fill="FFFFFF"/>
-            <w:tcMar>
-              <w:top w:w="50" w:type="dxa"/>
-              <w:bottom w:w="50" w:type="dxa"/>
-              <w:left w:w="80" w:type="dxa"/>
-              <w:right w:w="80" w:type="dxa"/>
-            </w:tcMar>
-          </w:tcPr>
-          <w:p>
-            <w:pPr>
-              <w:jc w:val="left"/>
-            </w:pPr>
-            <w:r>
-              <w:rPr>
-                <w:rFonts w:ascii="Arial" w:hAnsi="Arial"/>
-                <w:color w:val="222222"/>
-                <w:sz w:val="17"/>
-              </w:rPr>
-              <w:t>Inadequate lap length in longitudinal column reinforcement</w:t>
+              <w:t>Failure of welded tie connections between prestressed concrete trusses</w:t>
             </w:r>
           </w:p>
         </w:tc>
@@ -4283,7 +4334,7 @@
                 <w:color w:val="222222"/>
                 <w:sz w:val="17"/>
               </w:rPr>
-              <w:t>2.2%</w:t>
+              <w:t>1.9%</w:t>
             </w:r>
           </w:p>
         </w:tc>
@@ -4336,7 +4387,7 @@
                 <w:color w:val="222222"/>
                 <w:sz w:val="17"/>
               </w:rPr>
-              <w:t>ADD_RC_09</w:t>
+              <w:t>ADD_RC_07</w:t>
             </w:r>
           </w:p>
         </w:tc>
@@ -4361,7 +4412,7 @@
                 <w:color w:val="222222"/>
                 <w:sz w:val="17"/>
               </w:rPr>
-              <w:t>Shear cracks in cantilever stub beam supporting floating columns</w:t>
+              <w:t>Temporary steel section or wooden post propping of damaged open ground storeys</w:t>
             </w:r>
           </w:p>
         </w:tc>
@@ -4411,391 +4462,7 @@
                 <w:color w:val="222222"/>
                 <w:sz w:val="17"/>
               </w:rPr>
-              <w:t>2.2%</w:t>
-            </w:r>
-          </w:p>
-        </w:tc>
-      </w:tr>
-      <w:tr>
-        <w:tc>
-          <w:tcPr>
-            <w:tcW w:type="dxa" w:w="1584"/>
-            <w:shd w:fill="FFFFFF"/>
-            <w:tcMar>
-              <w:top w:w="50" w:type="dxa"/>
-              <w:bottom w:w="50" w:type="dxa"/>
-              <w:left w:w="80" w:type="dxa"/>
-              <w:right w:w="80" w:type="dxa"/>
-            </w:tcMar>
-          </w:tcPr>
-          <w:p>
-            <w:pPr>
-              <w:jc w:val="left"/>
-            </w:pPr>
-            <w:r>
-              <w:rPr>
-                <w:rFonts w:ascii="Arial" w:hAnsi="Arial"/>
-                <w:b/>
-                <w:color w:val="D95F02"/>
-                <w:sz w:val="17"/>
-              </w:rPr>
-              <w:t>Additional</w:t>
-            </w:r>
-          </w:p>
-        </w:tc>
-        <w:tc>
-          <w:tcPr>
-            <w:tcW w:type="dxa" w:w="1728"/>
-            <w:shd w:fill="FFFFFF"/>
-            <w:tcMar>
-              <w:top w:w="50" w:type="dxa"/>
-              <w:bottom w:w="50" w:type="dxa"/>
-              <w:left w:w="80" w:type="dxa"/>
-              <w:right w:w="80" w:type="dxa"/>
-            </w:tcMar>
-          </w:tcPr>
-          <w:p>
-            <w:pPr>
-              <w:jc w:val="left"/>
-            </w:pPr>
-            <w:r>
-              <w:rPr>
-                <w:rFonts w:ascii="Arial" w:hAnsi="Arial"/>
-                <w:color w:val="222222"/>
-                <w:sz w:val="17"/>
-              </w:rPr>
-              <w:t>ADD_RC_11</w:t>
-            </w:r>
-          </w:p>
-        </w:tc>
-        <w:tc>
-          <w:tcPr>
-            <w:tcW w:type="dxa" w:w="4752"/>
-            <w:shd w:fill="FFFFFF"/>
-            <w:tcMar>
-              <w:top w:w="50" w:type="dxa"/>
-              <w:bottom w:w="50" w:type="dxa"/>
-              <w:left w:w="80" w:type="dxa"/>
-              <w:right w:w="80" w:type="dxa"/>
-            </w:tcMar>
-          </w:tcPr>
-          <w:p>
-            <w:pPr>
-              <w:jc w:val="left"/>
-            </w:pPr>
-            <w:r>
-              <w:rPr>
-                <w:rFonts w:ascii="Arial" w:hAnsi="Arial"/>
-                <w:color w:val="222222"/>
-                <w:sz w:val="17"/>
-              </w:rPr>
-              <w:t>Dislodgement of precast roof panels atop precast frame due to inadequate connections</w:t>
-            </w:r>
-          </w:p>
-        </w:tc>
-        <w:tc>
-          <w:tcPr>
-            <w:tcW w:type="dxa" w:w="1152"/>
-            <w:shd w:fill="FFFFFF"/>
-            <w:tcMar>
-              <w:top w:w="50" w:type="dxa"/>
-              <w:bottom w:w="50" w:type="dxa"/>
-              <w:left w:w="80" w:type="dxa"/>
-              <w:right w:w="80" w:type="dxa"/>
-            </w:tcMar>
-          </w:tcPr>
-          <w:p>
-            <w:pPr>
-              <w:jc w:val="right"/>
-            </w:pPr>
-            <w:r>
-              <w:rPr>
-                <w:rFonts w:ascii="Arial" w:hAnsi="Arial"/>
-                <w:color w:val="222222"/>
-                <w:sz w:val="17"/>
-              </w:rPr>
-              <w:t>1</w:t>
-            </w:r>
-          </w:p>
-        </w:tc>
-        <w:tc>
-          <w:tcPr>
-            <w:tcW w:type="dxa" w:w="1152"/>
-            <w:shd w:fill="FFFFFF"/>
-            <w:tcMar>
-              <w:top w:w="50" w:type="dxa"/>
-              <w:bottom w:w="50" w:type="dxa"/>
-              <w:left w:w="80" w:type="dxa"/>
-              <w:right w:w="80" w:type="dxa"/>
-            </w:tcMar>
-          </w:tcPr>
-          <w:p>
-            <w:pPr>
-              <w:jc w:val="right"/>
-            </w:pPr>
-            <w:r>
-              <w:rPr>
-                <w:rFonts w:ascii="Arial" w:hAnsi="Arial"/>
-                <w:color w:val="222222"/>
-                <w:sz w:val="17"/>
-              </w:rPr>
-              <w:t>2.2%</w:t>
-            </w:r>
-          </w:p>
-        </w:tc>
-      </w:tr>
-      <w:tr>
-        <w:tc>
-          <w:tcPr>
-            <w:tcW w:type="dxa" w:w="1584"/>
-            <w:shd w:fill="F8F9FA"/>
-            <w:tcMar>
-              <w:top w:w="50" w:type="dxa"/>
-              <w:bottom w:w="50" w:type="dxa"/>
-              <w:left w:w="80" w:type="dxa"/>
-              <w:right w:w="80" w:type="dxa"/>
-            </w:tcMar>
-          </w:tcPr>
-          <w:p>
-            <w:pPr>
-              <w:jc w:val="left"/>
-            </w:pPr>
-            <w:r>
-              <w:rPr>
-                <w:rFonts w:ascii="Arial" w:hAnsi="Arial"/>
-                <w:b/>
-                <w:color w:val="D95F02"/>
-                <w:sz w:val="17"/>
-              </w:rPr>
-              <w:t>Additional</w:t>
-            </w:r>
-          </w:p>
-        </w:tc>
-        <w:tc>
-          <w:tcPr>
-            <w:tcW w:type="dxa" w:w="1728"/>
-            <w:shd w:fill="F8F9FA"/>
-            <w:tcMar>
-              <w:top w:w="50" w:type="dxa"/>
-              <w:bottom w:w="50" w:type="dxa"/>
-              <w:left w:w="80" w:type="dxa"/>
-              <w:right w:w="80" w:type="dxa"/>
-            </w:tcMar>
-          </w:tcPr>
-          <w:p>
-            <w:pPr>
-              <w:jc w:val="left"/>
-            </w:pPr>
-            <w:r>
-              <w:rPr>
-                <w:rFonts w:ascii="Arial" w:hAnsi="Arial"/>
-                <w:color w:val="222222"/>
-                <w:sz w:val="17"/>
-              </w:rPr>
-              <w:t>ADD_GEN_02</w:t>
-            </w:r>
-          </w:p>
-        </w:tc>
-        <w:tc>
-          <w:tcPr>
-            <w:tcW w:type="dxa" w:w="4752"/>
-            <w:shd w:fill="F8F9FA"/>
-            <w:tcMar>
-              <w:top w:w="50" w:type="dxa"/>
-              <w:bottom w:w="50" w:type="dxa"/>
-              <w:left w:w="80" w:type="dxa"/>
-              <w:right w:w="80" w:type="dxa"/>
-            </w:tcMar>
-          </w:tcPr>
-          <w:p>
-            <w:pPr>
-              <w:jc w:val="left"/>
-            </w:pPr>
-            <w:r>
-              <w:rPr>
-                <w:rFonts w:ascii="Arial" w:hAnsi="Arial"/>
-                <w:color w:val="222222"/>
-                <w:sz w:val="17"/>
-              </w:rPr>
-              <w:t>Failure of welded tie connections between prestressed concrete trusses</w:t>
-            </w:r>
-          </w:p>
-        </w:tc>
-        <w:tc>
-          <w:tcPr>
-            <w:tcW w:type="dxa" w:w="1152"/>
-            <w:shd w:fill="F8F9FA"/>
-            <w:tcMar>
-              <w:top w:w="50" w:type="dxa"/>
-              <w:bottom w:w="50" w:type="dxa"/>
-              <w:left w:w="80" w:type="dxa"/>
-              <w:right w:w="80" w:type="dxa"/>
-            </w:tcMar>
-          </w:tcPr>
-          <w:p>
-            <w:pPr>
-              <w:jc w:val="right"/>
-            </w:pPr>
-            <w:r>
-              <w:rPr>
-                <w:rFonts w:ascii="Arial" w:hAnsi="Arial"/>
-                <w:color w:val="222222"/>
-                <w:sz w:val="17"/>
-              </w:rPr>
-              <w:t>1</w:t>
-            </w:r>
-          </w:p>
-        </w:tc>
-        <w:tc>
-          <w:tcPr>
-            <w:tcW w:type="dxa" w:w="1152"/>
-            <w:shd w:fill="F8F9FA"/>
-            <w:tcMar>
-              <w:top w:w="50" w:type="dxa"/>
-              <w:bottom w:w="50" w:type="dxa"/>
-              <w:left w:w="80" w:type="dxa"/>
-              <w:right w:w="80" w:type="dxa"/>
-            </w:tcMar>
-          </w:tcPr>
-          <w:p>
-            <w:pPr>
-              <w:jc w:val="right"/>
-            </w:pPr>
-            <w:r>
-              <w:rPr>
-                <w:rFonts w:ascii="Arial" w:hAnsi="Arial"/>
-                <w:color w:val="222222"/>
-                <w:sz w:val="17"/>
-              </w:rPr>
-              <w:t>2.2%</w:t>
-            </w:r>
-          </w:p>
-        </w:tc>
-      </w:tr>
-      <w:tr>
-        <w:tc>
-          <w:tcPr>
-            <w:tcW w:type="dxa" w:w="1584"/>
-            <w:shd w:fill="FFFFFF"/>
-            <w:tcMar>
-              <w:top w:w="50" w:type="dxa"/>
-              <w:bottom w:w="50" w:type="dxa"/>
-              <w:left w:w="80" w:type="dxa"/>
-              <w:right w:w="80" w:type="dxa"/>
-            </w:tcMar>
-          </w:tcPr>
-          <w:p>
-            <w:pPr>
-              <w:jc w:val="left"/>
-            </w:pPr>
-            <w:r>
-              <w:rPr>
-                <w:rFonts w:ascii="Arial" w:hAnsi="Arial"/>
-                <w:b/>
-                <w:color w:val="D95F02"/>
-                <w:sz w:val="17"/>
-              </w:rPr>
-              <w:t>Additional</w:t>
-            </w:r>
-          </w:p>
-        </w:tc>
-        <w:tc>
-          <w:tcPr>
-            <w:tcW w:type="dxa" w:w="1728"/>
-            <w:shd w:fill="FFFFFF"/>
-            <w:tcMar>
-              <w:top w:w="50" w:type="dxa"/>
-              <w:bottom w:w="50" w:type="dxa"/>
-              <w:left w:w="80" w:type="dxa"/>
-              <w:right w:w="80" w:type="dxa"/>
-            </w:tcMar>
-          </w:tcPr>
-          <w:p>
-            <w:pPr>
-              <w:jc w:val="left"/>
-            </w:pPr>
-            <w:r>
-              <w:rPr>
-                <w:rFonts w:ascii="Arial" w:hAnsi="Arial"/>
-                <w:color w:val="222222"/>
-                <w:sz w:val="17"/>
-              </w:rPr>
-              <w:t>ADD_RC_07</w:t>
-            </w:r>
-          </w:p>
-        </w:tc>
-        <w:tc>
-          <w:tcPr>
-            <w:tcW w:type="dxa" w:w="4752"/>
-            <w:shd w:fill="FFFFFF"/>
-            <w:tcMar>
-              <w:top w:w="50" w:type="dxa"/>
-              <w:bottom w:w="50" w:type="dxa"/>
-              <w:left w:w="80" w:type="dxa"/>
-              <w:right w:w="80" w:type="dxa"/>
-            </w:tcMar>
-          </w:tcPr>
-          <w:p>
-            <w:pPr>
-              <w:jc w:val="left"/>
-            </w:pPr>
-            <w:r>
-              <w:rPr>
-                <w:rFonts w:ascii="Arial" w:hAnsi="Arial"/>
-                <w:color w:val="222222"/>
-                <w:sz w:val="17"/>
-              </w:rPr>
-              <w:t>Temporary steel section or wooden post propping of damaged open ground storeys</w:t>
-            </w:r>
-          </w:p>
-        </w:tc>
-        <w:tc>
-          <w:tcPr>
-            <w:tcW w:type="dxa" w:w="1152"/>
-            <w:shd w:fill="FFFFFF"/>
-            <w:tcMar>
-              <w:top w:w="50" w:type="dxa"/>
-              <w:bottom w:w="50" w:type="dxa"/>
-              <w:left w:w="80" w:type="dxa"/>
-              <w:right w:w="80" w:type="dxa"/>
-            </w:tcMar>
-          </w:tcPr>
-          <w:p>
-            <w:pPr>
-              <w:jc w:val="right"/>
-            </w:pPr>
-            <w:r>
-              <w:rPr>
-                <w:rFonts w:ascii="Arial" w:hAnsi="Arial"/>
-                <w:color w:val="222222"/>
-                <w:sz w:val="17"/>
-              </w:rPr>
-              <w:t>1</w:t>
-            </w:r>
-          </w:p>
-        </w:tc>
-        <w:tc>
-          <w:tcPr>
-            <w:tcW w:type="dxa" w:w="1152"/>
-            <w:shd w:fill="FFFFFF"/>
-            <w:tcMar>
-              <w:top w:w="50" w:type="dxa"/>
-              <w:bottom w:w="50" w:type="dxa"/>
-              <w:left w:w="80" w:type="dxa"/>
-              <w:right w:w="80" w:type="dxa"/>
-            </w:tcMar>
-          </w:tcPr>
-          <w:p>
-            <w:pPr>
-              <w:jc w:val="right"/>
-            </w:pPr>
-            <w:r>
-              <w:rPr>
-                <w:rFonts w:ascii="Arial" w:hAnsi="Arial"/>
-                <w:color w:val="222222"/>
-                <w:sz w:val="17"/>
-              </w:rPr>
-              <w:t>2.2%</w:t>
+              <w:t>1.9%</w:t>
             </w:r>
           </w:p>
         </w:tc>
@@ -4871,7 +4538,7 @@
           <w:rFonts w:ascii="Arial" w:hAnsi="Arial"/>
           <w:color w:val="2B5C8F"/>
         </w:rPr>
-        <w:t>Typology RRSM: Random Rubble Stone Masonry (Mud / Cement Mortar) (17 Buildings)</w:t>
+        <w:t>Typology RRSM: Random Rubble Stone Masonry (Mud / Cement Mortar) (25 Buildings)</w:t>
       </w:r>
     </w:p>
     <w:p>
@@ -4879,7 +4546,7 @@
         <w:spacing w:after="120"/>
       </w:pPr>
       <w:r>
-        <w:t>Detailed breakdown of observed NDMA RVS parameters and additional post-earthquake failure mechanisms identified across the 17 buildings of typology RRSM:</w:t>
+        <w:t>Detailed breakdown of observed NDMA RVS parameters and additional post-earthquake failure mechanisms identified across the 25 buildings of typology RRSM:</w:t>
       </w:r>
     </w:p>
     <w:tbl>
@@ -5124,7 +4791,7 @@
                 <w:color w:val="222222"/>
                 <w:sz w:val="17"/>
               </w:rPr>
-              <w:t>4</w:t>
+              <w:t>5</w:t>
             </w:r>
           </w:p>
         </w:tc>
@@ -5149,7 +4816,7 @@
                 <w:color w:val="222222"/>
                 <w:sz w:val="17"/>
               </w:rPr>
-              <w:t>23.5%</w:t>
+              <w:t>20.0%</w:t>
             </w:r>
           </w:p>
         </w:tc>
@@ -5277,7 +4944,7 @@
                 <w:color w:val="222222"/>
                 <w:sz w:val="17"/>
               </w:rPr>
-              <w:t>17.6%</w:t>
+              <w:t>12.0%</w:t>
             </w:r>
           </w:p>
         </w:tc>
@@ -5404,7 +5071,7 @@
                 <w:color w:val="222222"/>
                 <w:sz w:val="17"/>
               </w:rPr>
-              <w:t>5.9%</w:t>
+              <w:t>4.0%</w:t>
             </w:r>
           </w:p>
         </w:tc>
@@ -5531,7 +5198,7 @@
                 <w:color w:val="222222"/>
                 <w:sz w:val="17"/>
               </w:rPr>
-              <w:t>5.9%</w:t>
+              <w:t>4.0%</w:t>
             </w:r>
           </w:p>
         </w:tc>
@@ -5658,7 +5325,7 @@
                 <w:color w:val="222222"/>
                 <w:sz w:val="17"/>
               </w:rPr>
-              <w:t>5.9%</w:t>
+              <w:t>4.0%</w:t>
             </w:r>
           </w:p>
         </w:tc>
@@ -5785,7 +5452,7 @@
                 <w:color w:val="222222"/>
                 <w:sz w:val="17"/>
               </w:rPr>
-              <w:t>5.9%</w:t>
+              <w:t>4.0%</w:t>
             </w:r>
           </w:p>
         </w:tc>
@@ -5913,7 +5580,7 @@
                 <w:color w:val="222222"/>
                 <w:sz w:val="17"/>
               </w:rPr>
-              <w:t>5.9%</w:t>
+              <w:t>4.0%</w:t>
             </w:r>
           </w:p>
         </w:tc>
@@ -6040,7 +5707,7 @@
                 <w:color w:val="222222"/>
                 <w:sz w:val="17"/>
               </w:rPr>
-              <w:t>5.9%</w:t>
+              <w:t>4.0%</w:t>
             </w:r>
           </w:p>
         </w:tc>
@@ -6167,7 +5834,7 @@
                 <w:color w:val="222222"/>
                 <w:sz w:val="17"/>
               </w:rPr>
-              <w:t>5.9%</w:t>
+              <w:t>4.0%</w:t>
             </w:r>
           </w:p>
         </w:tc>
@@ -7163,7 +6830,7 @@
           <w:rFonts w:ascii="Arial" w:hAnsi="Arial"/>
           <w:sz w:val="19"/>
         </w:rPr>
-        <w:t>Rooftop swimming pool causing extreme mass irregularity and asymmetric torsional collapse — Observed in 9 building(s) (19.6%)</w:t>
+        <w:t>Rooftop swimming pool causing extreme mass irregularity and asymmetric torsional collapse — Observed in 9 building(s) (17.0%)</w:t>
       </w:r>
     </w:p>
     <w:p>
@@ -7185,7 +6852,7 @@
           <w:rFonts w:ascii="Arial" w:hAnsi="Arial"/>
           <w:sz w:val="19"/>
         </w:rPr>
-        <w:t>Common shared wall between adjacent buildings with differential response — Observed in 9 building(s) (19.6%)</w:t>
+        <w:t>Common shared wall between adjacent buildings with differential response — Observed in 9 building(s) (17.0%)</w:t>
       </w:r>
     </w:p>
     <w:p>
@@ -7207,7 +6874,7 @@
           <w:rFonts w:ascii="Arial" w:hAnsi="Arial"/>
           <w:sz w:val="19"/>
         </w:rPr>
-        <w:t>Collapse of intermediate storey in commercial RC frame — Observed in 8 building(s) (17.4%)</w:t>
+        <w:t>Collapse of intermediate storey in commercial RC frame — Observed in 8 building(s) (15.1%)</w:t>
       </w:r>
     </w:p>
     <w:p>
@@ -7229,7 +6896,7 @@
           <w:rFonts w:ascii="Arial" w:hAnsi="Arial"/>
           <w:sz w:val="19"/>
         </w:rPr>
-        <w:t>Lack of core confinement / 90-degree ties with excessive longitudinal spacing — Observed in 5 building(s) (10.9%)</w:t>
+        <w:t>Lack of core confinement / 90-degree ties with excessive longitudinal spacing — Observed in 5 building(s) (9.4%)</w:t>
       </w:r>
     </w:p>
     <w:p>
@@ -7251,7 +6918,7 @@
           <w:rFonts w:ascii="Arial" w:hAnsi="Arial"/>
           <w:sz w:val="19"/>
         </w:rPr>
-        <w:t>Pancake collapse of multi-storey educational frame structure — Observed in 4 building(s) (8.7%)</w:t>
+        <w:t>Pancake collapse of multi-storey educational frame structure — Observed in 4 building(s) (7.5%)</w:t>
       </w:r>
     </w:p>
     <w:p>
@@ -7273,7 +6940,7 @@
           <w:rFonts w:ascii="Arial" w:hAnsi="Arial"/>
           <w:sz w:val="19"/>
         </w:rPr>
-        <w:t>Improper post-earthquake column jacketing not extended to foundations or beam joints — Observed in 4 building(s) (8.7%)</w:t>
+        <w:t>Improper post-earthquake column jacketing not extended to foundations or beam joints — Observed in 4 building(s) (7.5%)</w:t>
       </w:r>
     </w:p>
     <w:p>
@@ -7295,7 +6962,7 @@
           <w:rFonts w:ascii="Arial" w:hAnsi="Arial"/>
           <w:sz w:val="19"/>
         </w:rPr>
-        <w:t>Dislodging of weakly connected overhead water tank appendages — Observed in 3 building(s) (6.5%)</w:t>
+        <w:t>Dislodging of weakly connected overhead water tank appendages — Observed in 3 building(s) (5.7%)</w:t>
       </w:r>
     </w:p>
     <w:p>
@@ -7317,7 +6984,7 @@
           <w:rFonts w:ascii="Arial" w:hAnsi="Arial"/>
           <w:sz w:val="19"/>
         </w:rPr>
-        <w:t>Insufficient connection between RC elevator core wall and adjacent framing — Observed in 2 building(s) (4.3%)</w:t>
+        <w:t>Insufficient connection between RC elevator core wall and adjacent framing — Observed in 2 building(s) (3.8%)</w:t>
       </w:r>
     </w:p>
     <w:p>
@@ -7339,7 +7006,7 @@
           <w:rFonts w:ascii="Arial" w:hAnsi="Arial"/>
           <w:sz w:val="19"/>
         </w:rPr>
-        <w:t>Inadequate lap length in longitudinal column reinforcement — Observed in 1 building(s) (2.2%)</w:t>
+        <w:t>Inadequate lap length in longitudinal column reinforcement — Observed in 1 building(s) (1.9%)</w:t>
       </w:r>
     </w:p>
     <w:p>
@@ -7361,7 +7028,7 @@
           <w:rFonts w:ascii="Arial" w:hAnsi="Arial"/>
           <w:sz w:val="19"/>
         </w:rPr>
-        <w:t>Shear cracks in cantilever stub beam supporting floating columns — Observed in 1 building(s) (2.2%)</w:t>
+        <w:t>Shear cracks in cantilever stub beam supporting floating columns — Observed in 1 building(s) (1.9%)</w:t>
       </w:r>
     </w:p>
     <w:p>
@@ -7383,7 +7050,7 @@
           <w:rFonts w:ascii="Arial" w:hAnsi="Arial"/>
           <w:sz w:val="19"/>
         </w:rPr>
-        <w:t>Dislodgement of precast roof panels atop precast frame due to inadequate connections — Observed in 1 building(s) (2.2%)</w:t>
+        <w:t>Dislodgement of precast roof panels atop precast frame due to inadequate connections — Observed in 1 building(s) (1.9%)</w:t>
       </w:r>
     </w:p>
     <w:p>
@@ -7405,7 +7072,7 @@
           <w:rFonts w:ascii="Arial" w:hAnsi="Arial"/>
           <w:sz w:val="19"/>
         </w:rPr>
-        <w:t>Failure of welded tie connections between prestressed concrete trusses — Observed in 1 building(s) (2.2%)</w:t>
+        <w:t>Failure of welded tie connections between prestressed concrete trusses — Observed in 1 building(s) (1.9%)</w:t>
       </w:r>
     </w:p>
     <w:p>
@@ -7427,7 +7094,7 @@
           <w:rFonts w:ascii="Arial" w:hAnsi="Arial"/>
           <w:sz w:val="19"/>
         </w:rPr>
-        <w:t>Temporary steel section or wooden post propping of damaged open ground storeys — Observed in 1 building(s) (2.2%)</w:t>
+        <w:t>Temporary steel section or wooden post propping of damaged open ground storeys — Observed in 1 building(s) (1.9%)</w:t>
       </w:r>
     </w:p>
     <w:p>
@@ -7449,7 +7116,7 @@
           <w:rFonts w:ascii="Arial" w:hAnsi="Arial"/>
           <w:sz w:val="19"/>
         </w:rPr>
-        <w:t>Out-of-plane collapse of stone masonry wall — Observed in 3 building(s) (17.6%)</w:t>
+        <w:t>Out-of-plane collapse of stone masonry wall — Observed in 3 building(s) (12.0%)</w:t>
       </w:r>
     </w:p>
     <w:p>
@@ -7471,7 +7138,7 @@
           <w:rFonts w:ascii="Arial" w:hAnsi="Arial"/>
           <w:sz w:val="19"/>
         </w:rPr>
-        <w:t>Collapse of staircase and building corner in multi-storey stone masonry — Observed in 1 building(s) (5.9%)</w:t>
+        <w:t>Collapse of staircase and building corner in multi-storey stone masonry — Observed in 1 building(s) (4.0%)</w:t>
       </w:r>
     </w:p>
     <w:sectPr>

</xml_diff>